<commit_message>
Mise a jour couleur dans les SF
</commit_message>
<xml_diff>
--- a/assets/document/SF.docx
+++ b/assets/document/SF.docx
@@ -70,12 +70,6 @@
         <w:gridCol w:w="6226"/>
       </w:tblGrid>
       <w:tr>
-        <w:tblPrEx>
-          <w:tblCellMar>
-            <w:top w:w="0" w:type="dxa"/>
-            <w:bottom w:w="0" w:type="dxa"/>
-          </w:tblCellMar>
-        </w:tblPrEx>
         <w:trPr>
           <w:tblHeader/>
         </w:trPr>
@@ -141,12 +135,6 @@
         </w:tc>
       </w:tr>
       <w:tr>
-        <w:tblPrEx>
-          <w:tblCellMar>
-            <w:top w:w="0" w:type="dxa"/>
-            <w:bottom w:w="0" w:type="dxa"/>
-          </w:tblCellMar>
-        </w:tblPrEx>
         <w:tc>
           <w:tcPr>
             <w:tcW w:w="2800" w:type="dxa"/>
@@ -205,12 +193,6 @@
         </w:tc>
       </w:tr>
       <w:tr>
-        <w:tblPrEx>
-          <w:tblCellMar>
-            <w:top w:w="0" w:type="dxa"/>
-            <w:bottom w:w="0" w:type="dxa"/>
-          </w:tblCellMar>
-        </w:tblPrEx>
         <w:tc>
           <w:tcPr>
             <w:tcW w:w="2800" w:type="dxa"/>
@@ -269,12 +251,6 @@
         </w:tc>
       </w:tr>
       <w:tr>
-        <w:tblPrEx>
-          <w:tblCellMar>
-            <w:top w:w="0" w:type="dxa"/>
-            <w:bottom w:w="0" w:type="dxa"/>
-          </w:tblCellMar>
-        </w:tblPrEx>
         <w:tc>
           <w:tcPr>
             <w:tcW w:w="2800" w:type="dxa"/>
@@ -333,12 +309,6 @@
         </w:tc>
       </w:tr>
       <w:tr>
-        <w:tblPrEx>
-          <w:tblCellMar>
-            <w:top w:w="0" w:type="dxa"/>
-            <w:bottom w:w="0" w:type="dxa"/>
-          </w:tblCellMar>
-        </w:tblPrEx>
         <w:tc>
           <w:tcPr>
             <w:tcW w:w="2800" w:type="dxa"/>
@@ -397,12 +367,6 @@
         </w:tc>
       </w:tr>
       <w:tr>
-        <w:tblPrEx>
-          <w:tblCellMar>
-            <w:top w:w="0" w:type="dxa"/>
-            <w:bottom w:w="0" w:type="dxa"/>
-          </w:tblCellMar>
-        </w:tblPrEx>
         <w:tc>
           <w:tcPr>
             <w:tcW w:w="2800" w:type="dxa"/>
@@ -461,12 +425,6 @@
         </w:tc>
       </w:tr>
       <w:tr>
-        <w:tblPrEx>
-          <w:tblCellMar>
-            <w:top w:w="0" w:type="dxa"/>
-            <w:bottom w:w="0" w:type="dxa"/>
-          </w:tblCellMar>
-        </w:tblPrEx>
         <w:tc>
           <w:tcPr>
             <w:tcW w:w="2800" w:type="dxa"/>
@@ -525,12 +483,6 @@
         </w:tc>
       </w:tr>
       <w:tr>
-        <w:tblPrEx>
-          <w:tblCellMar>
-            <w:top w:w="0" w:type="dxa"/>
-            <w:bottom w:w="0" w:type="dxa"/>
-          </w:tblCellMar>
-        </w:tblPrEx>
         <w:tc>
           <w:tcPr>
             <w:tcW w:w="2800" w:type="dxa"/>
@@ -912,12 +864,6 @@
         <w:gridCol w:w="5826"/>
       </w:tblGrid>
       <w:tr>
-        <w:tblPrEx>
-          <w:tblCellMar>
-            <w:top w:w="0" w:type="dxa"/>
-            <w:bottom w:w="0" w:type="dxa"/>
-          </w:tblCellMar>
-        </w:tblPrEx>
         <w:trPr>
           <w:tblHeader/>
         </w:trPr>
@@ -983,12 +929,6 @@
         </w:tc>
       </w:tr>
       <w:tr>
-        <w:tblPrEx>
-          <w:tblCellMar>
-            <w:top w:w="0" w:type="dxa"/>
-            <w:bottom w:w="0" w:type="dxa"/>
-          </w:tblCellMar>
-        </w:tblPrEx>
         <w:tc>
           <w:tcPr>
             <w:tcW w:w="3200" w:type="dxa"/>
@@ -1047,12 +987,6 @@
         </w:tc>
       </w:tr>
       <w:tr>
-        <w:tblPrEx>
-          <w:tblCellMar>
-            <w:top w:w="0" w:type="dxa"/>
-            <w:bottom w:w="0" w:type="dxa"/>
-          </w:tblCellMar>
-        </w:tblPrEx>
         <w:tc>
           <w:tcPr>
             <w:tcW w:w="3200" w:type="dxa"/>
@@ -1111,12 +1045,6 @@
         </w:tc>
       </w:tr>
       <w:tr>
-        <w:tblPrEx>
-          <w:tblCellMar>
-            <w:top w:w="0" w:type="dxa"/>
-            <w:bottom w:w="0" w:type="dxa"/>
-          </w:tblCellMar>
-        </w:tblPrEx>
         <w:tc>
           <w:tcPr>
             <w:tcW w:w="3200" w:type="dxa"/>
@@ -1175,12 +1103,6 @@
         </w:tc>
       </w:tr>
       <w:tr>
-        <w:tblPrEx>
-          <w:tblCellMar>
-            <w:top w:w="0" w:type="dxa"/>
-            <w:bottom w:w="0" w:type="dxa"/>
-          </w:tblCellMar>
-        </w:tblPrEx>
         <w:tc>
           <w:tcPr>
             <w:tcW w:w="3200" w:type="dxa"/>
@@ -1239,12 +1161,6 @@
         </w:tc>
       </w:tr>
       <w:tr>
-        <w:tblPrEx>
-          <w:tblCellMar>
-            <w:top w:w="0" w:type="dxa"/>
-            <w:bottom w:w="0" w:type="dxa"/>
-          </w:tblCellMar>
-        </w:tblPrEx>
         <w:tc>
           <w:tcPr>
             <w:tcW w:w="3200" w:type="dxa"/>
@@ -1303,12 +1219,6 @@
         </w:tc>
       </w:tr>
       <w:tr>
-        <w:tblPrEx>
-          <w:tblCellMar>
-            <w:top w:w="0" w:type="dxa"/>
-            <w:bottom w:w="0" w:type="dxa"/>
-          </w:tblCellMar>
-        </w:tblPrEx>
         <w:tc>
           <w:tcPr>
             <w:tcW w:w="3200" w:type="dxa"/>
@@ -1827,12 +1737,6 @@
         <w:gridCol w:w="9026"/>
       </w:tblGrid>
       <w:tr>
-        <w:tblPrEx>
-          <w:tblCellMar>
-            <w:top w:w="0" w:type="dxa"/>
-            <w:bottom w:w="0" w:type="dxa"/>
-          </w:tblCellMar>
-        </w:tblPrEx>
         <w:tc>
           <w:tcPr>
             <w:tcW w:w="0" w:type="auto"/>
@@ -2214,12 +2118,6 @@
         <w:gridCol w:w="6826"/>
       </w:tblGrid>
       <w:tr>
-        <w:tblPrEx>
-          <w:tblCellMar>
-            <w:top w:w="0" w:type="dxa"/>
-            <w:bottom w:w="0" w:type="dxa"/>
-          </w:tblCellMar>
-        </w:tblPrEx>
         <w:tc>
           <w:tcPr>
             <w:tcW w:w="2200" w:type="dxa"/>
@@ -2280,12 +2178,6 @@
         </w:tc>
       </w:tr>
       <w:tr>
-        <w:tblPrEx>
-          <w:tblCellMar>
-            <w:top w:w="0" w:type="dxa"/>
-            <w:bottom w:w="0" w:type="dxa"/>
-          </w:tblCellMar>
-        </w:tblPrEx>
         <w:tc>
           <w:tcPr>
             <w:tcW w:w="2200" w:type="dxa"/>
@@ -2346,12 +2238,6 @@
         </w:tc>
       </w:tr>
       <w:tr>
-        <w:tblPrEx>
-          <w:tblCellMar>
-            <w:top w:w="0" w:type="dxa"/>
-            <w:bottom w:w="0" w:type="dxa"/>
-          </w:tblCellMar>
-        </w:tblPrEx>
         <w:tc>
           <w:tcPr>
             <w:tcW w:w="2200" w:type="dxa"/>
@@ -2412,12 +2298,6 @@
         </w:tc>
       </w:tr>
       <w:tr>
-        <w:tblPrEx>
-          <w:tblCellMar>
-            <w:top w:w="0" w:type="dxa"/>
-            <w:bottom w:w="0" w:type="dxa"/>
-          </w:tblCellMar>
-        </w:tblPrEx>
         <w:tc>
           <w:tcPr>
             <w:tcW w:w="2200" w:type="dxa"/>
@@ -2478,12 +2358,6 @@
         </w:tc>
       </w:tr>
       <w:tr>
-        <w:tblPrEx>
-          <w:tblCellMar>
-            <w:top w:w="0" w:type="dxa"/>
-            <w:bottom w:w="0" w:type="dxa"/>
-          </w:tblCellMar>
-        </w:tblPrEx>
         <w:tc>
           <w:tcPr>
             <w:tcW w:w="2200" w:type="dxa"/>
@@ -2544,12 +2418,6 @@
         </w:tc>
       </w:tr>
       <w:tr>
-        <w:tblPrEx>
-          <w:tblCellMar>
-            <w:top w:w="0" w:type="dxa"/>
-            <w:bottom w:w="0" w:type="dxa"/>
-          </w:tblCellMar>
-        </w:tblPrEx>
         <w:tc>
           <w:tcPr>
             <w:tcW w:w="2200" w:type="dxa"/>
@@ -2610,12 +2478,6 @@
         </w:tc>
       </w:tr>
       <w:tr>
-        <w:tblPrEx>
-          <w:tblCellMar>
-            <w:top w:w="0" w:type="dxa"/>
-            <w:bottom w:w="0" w:type="dxa"/>
-          </w:tblCellMar>
-        </w:tblPrEx>
         <w:tc>
           <w:tcPr>
             <w:tcW w:w="2200" w:type="dxa"/>
@@ -2676,12 +2538,6 @@
         </w:tc>
       </w:tr>
       <w:tr>
-        <w:tblPrEx>
-          <w:tblCellMar>
-            <w:top w:w="0" w:type="dxa"/>
-            <w:bottom w:w="0" w:type="dxa"/>
-          </w:tblCellMar>
-        </w:tblPrEx>
         <w:tc>
           <w:tcPr>
             <w:tcW w:w="2200" w:type="dxa"/>
@@ -2784,12 +2640,6 @@
         <w:gridCol w:w="6826"/>
       </w:tblGrid>
       <w:tr>
-        <w:tblPrEx>
-          <w:tblCellMar>
-            <w:top w:w="0" w:type="dxa"/>
-            <w:bottom w:w="0" w:type="dxa"/>
-          </w:tblCellMar>
-        </w:tblPrEx>
         <w:tc>
           <w:tcPr>
             <w:tcW w:w="2200" w:type="dxa"/>
@@ -2850,12 +2700,6 @@
         </w:tc>
       </w:tr>
       <w:tr>
-        <w:tblPrEx>
-          <w:tblCellMar>
-            <w:top w:w="0" w:type="dxa"/>
-            <w:bottom w:w="0" w:type="dxa"/>
-          </w:tblCellMar>
-        </w:tblPrEx>
         <w:tc>
           <w:tcPr>
             <w:tcW w:w="2200" w:type="dxa"/>
@@ -2916,12 +2760,6 @@
         </w:tc>
       </w:tr>
       <w:tr>
-        <w:tblPrEx>
-          <w:tblCellMar>
-            <w:top w:w="0" w:type="dxa"/>
-            <w:bottom w:w="0" w:type="dxa"/>
-          </w:tblCellMar>
-        </w:tblPrEx>
         <w:tc>
           <w:tcPr>
             <w:tcW w:w="2200" w:type="dxa"/>
@@ -2982,12 +2820,6 @@
         </w:tc>
       </w:tr>
       <w:tr>
-        <w:tblPrEx>
-          <w:tblCellMar>
-            <w:top w:w="0" w:type="dxa"/>
-            <w:bottom w:w="0" w:type="dxa"/>
-          </w:tblCellMar>
-        </w:tblPrEx>
         <w:tc>
           <w:tcPr>
             <w:tcW w:w="2200" w:type="dxa"/>
@@ -3048,12 +2880,6 @@
         </w:tc>
       </w:tr>
       <w:tr>
-        <w:tblPrEx>
-          <w:tblCellMar>
-            <w:top w:w="0" w:type="dxa"/>
-            <w:bottom w:w="0" w:type="dxa"/>
-          </w:tblCellMar>
-        </w:tblPrEx>
         <w:tc>
           <w:tcPr>
             <w:tcW w:w="2200" w:type="dxa"/>
@@ -3114,12 +2940,6 @@
         </w:tc>
       </w:tr>
       <w:tr>
-        <w:tblPrEx>
-          <w:tblCellMar>
-            <w:top w:w="0" w:type="dxa"/>
-            <w:bottom w:w="0" w:type="dxa"/>
-          </w:tblCellMar>
-        </w:tblPrEx>
         <w:tc>
           <w:tcPr>
             <w:tcW w:w="2200" w:type="dxa"/>
@@ -3180,12 +3000,6 @@
         </w:tc>
       </w:tr>
       <w:tr>
-        <w:tblPrEx>
-          <w:tblCellMar>
-            <w:top w:w="0" w:type="dxa"/>
-            <w:bottom w:w="0" w:type="dxa"/>
-          </w:tblCellMar>
-        </w:tblPrEx>
         <w:tc>
           <w:tcPr>
             <w:tcW w:w="2200" w:type="dxa"/>
@@ -3288,12 +3102,6 @@
         <w:gridCol w:w="6826"/>
       </w:tblGrid>
       <w:tr>
-        <w:tblPrEx>
-          <w:tblCellMar>
-            <w:top w:w="0" w:type="dxa"/>
-            <w:bottom w:w="0" w:type="dxa"/>
-          </w:tblCellMar>
-        </w:tblPrEx>
         <w:tc>
           <w:tcPr>
             <w:tcW w:w="2200" w:type="dxa"/>
@@ -3354,12 +3162,6 @@
         </w:tc>
       </w:tr>
       <w:tr>
-        <w:tblPrEx>
-          <w:tblCellMar>
-            <w:top w:w="0" w:type="dxa"/>
-            <w:bottom w:w="0" w:type="dxa"/>
-          </w:tblCellMar>
-        </w:tblPrEx>
         <w:tc>
           <w:tcPr>
             <w:tcW w:w="2200" w:type="dxa"/>
@@ -3420,12 +3222,6 @@
         </w:tc>
       </w:tr>
       <w:tr>
-        <w:tblPrEx>
-          <w:tblCellMar>
-            <w:top w:w="0" w:type="dxa"/>
-            <w:bottom w:w="0" w:type="dxa"/>
-          </w:tblCellMar>
-        </w:tblPrEx>
         <w:tc>
           <w:tcPr>
             <w:tcW w:w="2200" w:type="dxa"/>
@@ -3486,12 +3282,6 @@
         </w:tc>
       </w:tr>
       <w:tr>
-        <w:tblPrEx>
-          <w:tblCellMar>
-            <w:top w:w="0" w:type="dxa"/>
-            <w:bottom w:w="0" w:type="dxa"/>
-          </w:tblCellMar>
-        </w:tblPrEx>
         <w:tc>
           <w:tcPr>
             <w:tcW w:w="2200" w:type="dxa"/>
@@ -3552,12 +3342,6 @@
         </w:tc>
       </w:tr>
       <w:tr>
-        <w:tblPrEx>
-          <w:tblCellMar>
-            <w:top w:w="0" w:type="dxa"/>
-            <w:bottom w:w="0" w:type="dxa"/>
-          </w:tblCellMar>
-        </w:tblPrEx>
         <w:tc>
           <w:tcPr>
             <w:tcW w:w="2200" w:type="dxa"/>
@@ -3618,12 +3402,6 @@
         </w:tc>
       </w:tr>
       <w:tr>
-        <w:tblPrEx>
-          <w:tblCellMar>
-            <w:top w:w="0" w:type="dxa"/>
-            <w:bottom w:w="0" w:type="dxa"/>
-          </w:tblCellMar>
-        </w:tblPrEx>
         <w:tc>
           <w:tcPr>
             <w:tcW w:w="2200" w:type="dxa"/>
@@ -3684,12 +3462,6 @@
         </w:tc>
       </w:tr>
       <w:tr>
-        <w:tblPrEx>
-          <w:tblCellMar>
-            <w:top w:w="0" w:type="dxa"/>
-            <w:bottom w:w="0" w:type="dxa"/>
-          </w:tblCellMar>
-        </w:tblPrEx>
         <w:tc>
           <w:tcPr>
             <w:tcW w:w="2200" w:type="dxa"/>
@@ -3751,12 +3523,6 @@
         </w:tc>
       </w:tr>
       <w:tr>
-        <w:tblPrEx>
-          <w:tblCellMar>
-            <w:top w:w="0" w:type="dxa"/>
-            <w:bottom w:w="0" w:type="dxa"/>
-          </w:tblCellMar>
-        </w:tblPrEx>
         <w:tc>
           <w:tcPr>
             <w:tcW w:w="2200" w:type="dxa"/>
@@ -3859,12 +3625,6 @@
         <w:gridCol w:w="6826"/>
       </w:tblGrid>
       <w:tr>
-        <w:tblPrEx>
-          <w:tblCellMar>
-            <w:top w:w="0" w:type="dxa"/>
-            <w:bottom w:w="0" w:type="dxa"/>
-          </w:tblCellMar>
-        </w:tblPrEx>
         <w:tc>
           <w:tcPr>
             <w:tcW w:w="2200" w:type="dxa"/>
@@ -3925,12 +3685,6 @@
         </w:tc>
       </w:tr>
       <w:tr>
-        <w:tblPrEx>
-          <w:tblCellMar>
-            <w:top w:w="0" w:type="dxa"/>
-            <w:bottom w:w="0" w:type="dxa"/>
-          </w:tblCellMar>
-        </w:tblPrEx>
         <w:tc>
           <w:tcPr>
             <w:tcW w:w="2200" w:type="dxa"/>
@@ -3991,12 +3745,6 @@
         </w:tc>
       </w:tr>
       <w:tr>
-        <w:tblPrEx>
-          <w:tblCellMar>
-            <w:top w:w="0" w:type="dxa"/>
-            <w:bottom w:w="0" w:type="dxa"/>
-          </w:tblCellMar>
-        </w:tblPrEx>
         <w:tc>
           <w:tcPr>
             <w:tcW w:w="2200" w:type="dxa"/>
@@ -4057,12 +3805,6 @@
         </w:tc>
       </w:tr>
       <w:tr>
-        <w:tblPrEx>
-          <w:tblCellMar>
-            <w:top w:w="0" w:type="dxa"/>
-            <w:bottom w:w="0" w:type="dxa"/>
-          </w:tblCellMar>
-        </w:tblPrEx>
         <w:tc>
           <w:tcPr>
             <w:tcW w:w="2200" w:type="dxa"/>
@@ -4123,12 +3865,6 @@
         </w:tc>
       </w:tr>
       <w:tr>
-        <w:tblPrEx>
-          <w:tblCellMar>
-            <w:top w:w="0" w:type="dxa"/>
-            <w:bottom w:w="0" w:type="dxa"/>
-          </w:tblCellMar>
-        </w:tblPrEx>
         <w:tc>
           <w:tcPr>
             <w:tcW w:w="2200" w:type="dxa"/>
@@ -4189,12 +3925,6 @@
         </w:tc>
       </w:tr>
       <w:tr>
-        <w:tblPrEx>
-          <w:tblCellMar>
-            <w:top w:w="0" w:type="dxa"/>
-            <w:bottom w:w="0" w:type="dxa"/>
-          </w:tblCellMar>
-        </w:tblPrEx>
         <w:tc>
           <w:tcPr>
             <w:tcW w:w="2200" w:type="dxa"/>
@@ -4255,12 +3985,6 @@
         </w:tc>
       </w:tr>
       <w:tr>
-        <w:tblPrEx>
-          <w:tblCellMar>
-            <w:top w:w="0" w:type="dxa"/>
-            <w:bottom w:w="0" w:type="dxa"/>
-          </w:tblCellMar>
-        </w:tblPrEx>
         <w:tc>
           <w:tcPr>
             <w:tcW w:w="2200" w:type="dxa"/>
@@ -4363,12 +4087,6 @@
         <w:gridCol w:w="6826"/>
       </w:tblGrid>
       <w:tr>
-        <w:tblPrEx>
-          <w:tblCellMar>
-            <w:top w:w="0" w:type="dxa"/>
-            <w:bottom w:w="0" w:type="dxa"/>
-          </w:tblCellMar>
-        </w:tblPrEx>
         <w:tc>
           <w:tcPr>
             <w:tcW w:w="2200" w:type="dxa"/>
@@ -4429,12 +4147,6 @@
         </w:tc>
       </w:tr>
       <w:tr>
-        <w:tblPrEx>
-          <w:tblCellMar>
-            <w:top w:w="0" w:type="dxa"/>
-            <w:bottom w:w="0" w:type="dxa"/>
-          </w:tblCellMar>
-        </w:tblPrEx>
         <w:tc>
           <w:tcPr>
             <w:tcW w:w="2200" w:type="dxa"/>
@@ -4495,12 +4207,6 @@
         </w:tc>
       </w:tr>
       <w:tr>
-        <w:tblPrEx>
-          <w:tblCellMar>
-            <w:top w:w="0" w:type="dxa"/>
-            <w:bottom w:w="0" w:type="dxa"/>
-          </w:tblCellMar>
-        </w:tblPrEx>
         <w:tc>
           <w:tcPr>
             <w:tcW w:w="2200" w:type="dxa"/>
@@ -4561,12 +4267,6 @@
         </w:tc>
       </w:tr>
       <w:tr>
-        <w:tblPrEx>
-          <w:tblCellMar>
-            <w:top w:w="0" w:type="dxa"/>
-            <w:bottom w:w="0" w:type="dxa"/>
-          </w:tblCellMar>
-        </w:tblPrEx>
         <w:tc>
           <w:tcPr>
             <w:tcW w:w="2200" w:type="dxa"/>
@@ -4627,12 +4327,6 @@
         </w:tc>
       </w:tr>
       <w:tr>
-        <w:tblPrEx>
-          <w:tblCellMar>
-            <w:top w:w="0" w:type="dxa"/>
-            <w:bottom w:w="0" w:type="dxa"/>
-          </w:tblCellMar>
-        </w:tblPrEx>
         <w:tc>
           <w:tcPr>
             <w:tcW w:w="2200" w:type="dxa"/>
@@ -4693,12 +4387,6 @@
         </w:tc>
       </w:tr>
       <w:tr>
-        <w:tblPrEx>
-          <w:tblCellMar>
-            <w:top w:w="0" w:type="dxa"/>
-            <w:bottom w:w="0" w:type="dxa"/>
-          </w:tblCellMar>
-        </w:tblPrEx>
         <w:tc>
           <w:tcPr>
             <w:tcW w:w="2200" w:type="dxa"/>
@@ -4759,12 +4447,6 @@
         </w:tc>
       </w:tr>
       <w:tr>
-        <w:tblPrEx>
-          <w:tblCellMar>
-            <w:top w:w="0" w:type="dxa"/>
-            <w:bottom w:w="0" w:type="dxa"/>
-          </w:tblCellMar>
-        </w:tblPrEx>
         <w:tc>
           <w:tcPr>
             <w:tcW w:w="2200" w:type="dxa"/>
@@ -4825,12 +4507,6 @@
         </w:tc>
       </w:tr>
       <w:tr>
-        <w:tblPrEx>
-          <w:tblCellMar>
-            <w:top w:w="0" w:type="dxa"/>
-            <w:bottom w:w="0" w:type="dxa"/>
-          </w:tblCellMar>
-        </w:tblPrEx>
         <w:tc>
           <w:tcPr>
             <w:tcW w:w="2200" w:type="dxa"/>
@@ -4933,12 +4609,6 @@
         <w:gridCol w:w="6826"/>
       </w:tblGrid>
       <w:tr>
-        <w:tblPrEx>
-          <w:tblCellMar>
-            <w:top w:w="0" w:type="dxa"/>
-            <w:bottom w:w="0" w:type="dxa"/>
-          </w:tblCellMar>
-        </w:tblPrEx>
         <w:tc>
           <w:tcPr>
             <w:tcW w:w="2200" w:type="dxa"/>
@@ -4999,12 +4669,6 @@
         </w:tc>
       </w:tr>
       <w:tr>
-        <w:tblPrEx>
-          <w:tblCellMar>
-            <w:top w:w="0" w:type="dxa"/>
-            <w:bottom w:w="0" w:type="dxa"/>
-          </w:tblCellMar>
-        </w:tblPrEx>
         <w:tc>
           <w:tcPr>
             <w:tcW w:w="2200" w:type="dxa"/>
@@ -5065,12 +4729,6 @@
         </w:tc>
       </w:tr>
       <w:tr>
-        <w:tblPrEx>
-          <w:tblCellMar>
-            <w:top w:w="0" w:type="dxa"/>
-            <w:bottom w:w="0" w:type="dxa"/>
-          </w:tblCellMar>
-        </w:tblPrEx>
         <w:tc>
           <w:tcPr>
             <w:tcW w:w="2200" w:type="dxa"/>
@@ -5131,12 +4789,6 @@
         </w:tc>
       </w:tr>
       <w:tr>
-        <w:tblPrEx>
-          <w:tblCellMar>
-            <w:top w:w="0" w:type="dxa"/>
-            <w:bottom w:w="0" w:type="dxa"/>
-          </w:tblCellMar>
-        </w:tblPrEx>
         <w:tc>
           <w:tcPr>
             <w:tcW w:w="2200" w:type="dxa"/>
@@ -5197,12 +4849,6 @@
         </w:tc>
       </w:tr>
       <w:tr>
-        <w:tblPrEx>
-          <w:tblCellMar>
-            <w:top w:w="0" w:type="dxa"/>
-            <w:bottom w:w="0" w:type="dxa"/>
-          </w:tblCellMar>
-        </w:tblPrEx>
         <w:tc>
           <w:tcPr>
             <w:tcW w:w="2200" w:type="dxa"/>
@@ -5264,12 +4910,6 @@
         </w:tc>
       </w:tr>
       <w:tr>
-        <w:tblPrEx>
-          <w:tblCellMar>
-            <w:top w:w="0" w:type="dxa"/>
-            <w:bottom w:w="0" w:type="dxa"/>
-          </w:tblCellMar>
-        </w:tblPrEx>
         <w:tc>
           <w:tcPr>
             <w:tcW w:w="2200" w:type="dxa"/>
@@ -5330,12 +4970,6 @@
         </w:tc>
       </w:tr>
       <w:tr>
-        <w:tblPrEx>
-          <w:tblCellMar>
-            <w:top w:w="0" w:type="dxa"/>
-            <w:bottom w:w="0" w:type="dxa"/>
-          </w:tblCellMar>
-        </w:tblPrEx>
         <w:tc>
           <w:tcPr>
             <w:tcW w:w="2200" w:type="dxa"/>
@@ -5396,12 +5030,6 @@
         </w:tc>
       </w:tr>
       <w:tr>
-        <w:tblPrEx>
-          <w:tblCellMar>
-            <w:top w:w="0" w:type="dxa"/>
-            <w:bottom w:w="0" w:type="dxa"/>
-          </w:tblCellMar>
-        </w:tblPrEx>
         <w:tc>
           <w:tcPr>
             <w:tcW w:w="2200" w:type="dxa"/>
@@ -5504,12 +5132,6 @@
         <w:gridCol w:w="6826"/>
       </w:tblGrid>
       <w:tr>
-        <w:tblPrEx>
-          <w:tblCellMar>
-            <w:top w:w="0" w:type="dxa"/>
-            <w:bottom w:w="0" w:type="dxa"/>
-          </w:tblCellMar>
-        </w:tblPrEx>
         <w:tc>
           <w:tcPr>
             <w:tcW w:w="2200" w:type="dxa"/>
@@ -5570,12 +5192,6 @@
         </w:tc>
       </w:tr>
       <w:tr>
-        <w:tblPrEx>
-          <w:tblCellMar>
-            <w:top w:w="0" w:type="dxa"/>
-            <w:bottom w:w="0" w:type="dxa"/>
-          </w:tblCellMar>
-        </w:tblPrEx>
         <w:tc>
           <w:tcPr>
             <w:tcW w:w="2200" w:type="dxa"/>
@@ -5636,12 +5252,6 @@
         </w:tc>
       </w:tr>
       <w:tr>
-        <w:tblPrEx>
-          <w:tblCellMar>
-            <w:top w:w="0" w:type="dxa"/>
-            <w:bottom w:w="0" w:type="dxa"/>
-          </w:tblCellMar>
-        </w:tblPrEx>
         <w:tc>
           <w:tcPr>
             <w:tcW w:w="2200" w:type="dxa"/>
@@ -5702,12 +5312,6 @@
         </w:tc>
       </w:tr>
       <w:tr>
-        <w:tblPrEx>
-          <w:tblCellMar>
-            <w:top w:w="0" w:type="dxa"/>
-            <w:bottom w:w="0" w:type="dxa"/>
-          </w:tblCellMar>
-        </w:tblPrEx>
         <w:tc>
           <w:tcPr>
             <w:tcW w:w="2200" w:type="dxa"/>
@@ -5768,12 +5372,6 @@
         </w:tc>
       </w:tr>
       <w:tr>
-        <w:tblPrEx>
-          <w:tblCellMar>
-            <w:top w:w="0" w:type="dxa"/>
-            <w:bottom w:w="0" w:type="dxa"/>
-          </w:tblCellMar>
-        </w:tblPrEx>
         <w:tc>
           <w:tcPr>
             <w:tcW w:w="2200" w:type="dxa"/>
@@ -5834,12 +5432,6 @@
         </w:tc>
       </w:tr>
       <w:tr>
-        <w:tblPrEx>
-          <w:tblCellMar>
-            <w:top w:w="0" w:type="dxa"/>
-            <w:bottom w:w="0" w:type="dxa"/>
-          </w:tblCellMar>
-        </w:tblPrEx>
         <w:tc>
           <w:tcPr>
             <w:tcW w:w="2200" w:type="dxa"/>
@@ -5900,12 +5492,6 @@
         </w:tc>
       </w:tr>
       <w:tr>
-        <w:tblPrEx>
-          <w:tblCellMar>
-            <w:top w:w="0" w:type="dxa"/>
-            <w:bottom w:w="0" w:type="dxa"/>
-          </w:tblCellMar>
-        </w:tblPrEx>
         <w:tc>
           <w:tcPr>
             <w:tcW w:w="2200" w:type="dxa"/>
@@ -6008,12 +5594,6 @@
         <w:gridCol w:w="6826"/>
       </w:tblGrid>
       <w:tr>
-        <w:tblPrEx>
-          <w:tblCellMar>
-            <w:top w:w="0" w:type="dxa"/>
-            <w:bottom w:w="0" w:type="dxa"/>
-          </w:tblCellMar>
-        </w:tblPrEx>
         <w:tc>
           <w:tcPr>
             <w:tcW w:w="2200" w:type="dxa"/>
@@ -6074,12 +5654,6 @@
         </w:tc>
       </w:tr>
       <w:tr>
-        <w:tblPrEx>
-          <w:tblCellMar>
-            <w:top w:w="0" w:type="dxa"/>
-            <w:bottom w:w="0" w:type="dxa"/>
-          </w:tblCellMar>
-        </w:tblPrEx>
         <w:tc>
           <w:tcPr>
             <w:tcW w:w="2200" w:type="dxa"/>
@@ -6140,12 +5714,6 @@
         </w:tc>
       </w:tr>
       <w:tr>
-        <w:tblPrEx>
-          <w:tblCellMar>
-            <w:top w:w="0" w:type="dxa"/>
-            <w:bottom w:w="0" w:type="dxa"/>
-          </w:tblCellMar>
-        </w:tblPrEx>
         <w:tc>
           <w:tcPr>
             <w:tcW w:w="2200" w:type="dxa"/>
@@ -6206,12 +5774,6 @@
         </w:tc>
       </w:tr>
       <w:tr>
-        <w:tblPrEx>
-          <w:tblCellMar>
-            <w:top w:w="0" w:type="dxa"/>
-            <w:bottom w:w="0" w:type="dxa"/>
-          </w:tblCellMar>
-        </w:tblPrEx>
         <w:tc>
           <w:tcPr>
             <w:tcW w:w="2200" w:type="dxa"/>
@@ -6272,12 +5834,6 @@
         </w:tc>
       </w:tr>
       <w:tr>
-        <w:tblPrEx>
-          <w:tblCellMar>
-            <w:top w:w="0" w:type="dxa"/>
-            <w:bottom w:w="0" w:type="dxa"/>
-          </w:tblCellMar>
-        </w:tblPrEx>
         <w:tc>
           <w:tcPr>
             <w:tcW w:w="2200" w:type="dxa"/>
@@ -6338,12 +5894,6 @@
         </w:tc>
       </w:tr>
       <w:tr>
-        <w:tblPrEx>
-          <w:tblCellMar>
-            <w:top w:w="0" w:type="dxa"/>
-            <w:bottom w:w="0" w:type="dxa"/>
-          </w:tblCellMar>
-        </w:tblPrEx>
         <w:tc>
           <w:tcPr>
             <w:tcW w:w="2200" w:type="dxa"/>
@@ -6404,12 +5954,6 @@
         </w:tc>
       </w:tr>
       <w:tr>
-        <w:tblPrEx>
-          <w:tblCellMar>
-            <w:top w:w="0" w:type="dxa"/>
-            <w:bottom w:w="0" w:type="dxa"/>
-          </w:tblCellMar>
-        </w:tblPrEx>
         <w:tc>
           <w:tcPr>
             <w:tcW w:w="2200" w:type="dxa"/>
@@ -6533,12 +6077,6 @@
         <w:gridCol w:w="6826"/>
       </w:tblGrid>
       <w:tr>
-        <w:tblPrEx>
-          <w:tblCellMar>
-            <w:top w:w="0" w:type="dxa"/>
-            <w:bottom w:w="0" w:type="dxa"/>
-          </w:tblCellMar>
-        </w:tblPrEx>
         <w:tc>
           <w:tcPr>
             <w:tcW w:w="2200" w:type="dxa"/>
@@ -6599,12 +6137,6 @@
         </w:tc>
       </w:tr>
       <w:tr>
-        <w:tblPrEx>
-          <w:tblCellMar>
-            <w:top w:w="0" w:type="dxa"/>
-            <w:bottom w:w="0" w:type="dxa"/>
-          </w:tblCellMar>
-        </w:tblPrEx>
         <w:tc>
           <w:tcPr>
             <w:tcW w:w="2200" w:type="dxa"/>
@@ -6665,12 +6197,6 @@
         </w:tc>
       </w:tr>
       <w:tr>
-        <w:tblPrEx>
-          <w:tblCellMar>
-            <w:top w:w="0" w:type="dxa"/>
-            <w:bottom w:w="0" w:type="dxa"/>
-          </w:tblCellMar>
-        </w:tblPrEx>
         <w:tc>
           <w:tcPr>
             <w:tcW w:w="2200" w:type="dxa"/>
@@ -6731,12 +6257,6 @@
         </w:tc>
       </w:tr>
       <w:tr>
-        <w:tblPrEx>
-          <w:tblCellMar>
-            <w:top w:w="0" w:type="dxa"/>
-            <w:bottom w:w="0" w:type="dxa"/>
-          </w:tblCellMar>
-        </w:tblPrEx>
         <w:tc>
           <w:tcPr>
             <w:tcW w:w="2200" w:type="dxa"/>
@@ -6797,12 +6317,6 @@
         </w:tc>
       </w:tr>
       <w:tr>
-        <w:tblPrEx>
-          <w:tblCellMar>
-            <w:top w:w="0" w:type="dxa"/>
-            <w:bottom w:w="0" w:type="dxa"/>
-          </w:tblCellMar>
-        </w:tblPrEx>
         <w:tc>
           <w:tcPr>
             <w:tcW w:w="2200" w:type="dxa"/>
@@ -6863,12 +6377,6 @@
         </w:tc>
       </w:tr>
       <w:tr>
-        <w:tblPrEx>
-          <w:tblCellMar>
-            <w:top w:w="0" w:type="dxa"/>
-            <w:bottom w:w="0" w:type="dxa"/>
-          </w:tblCellMar>
-        </w:tblPrEx>
         <w:tc>
           <w:tcPr>
             <w:tcW w:w="2200" w:type="dxa"/>
@@ -6929,12 +6437,6 @@
         </w:tc>
       </w:tr>
       <w:tr>
-        <w:tblPrEx>
-          <w:tblCellMar>
-            <w:top w:w="0" w:type="dxa"/>
-            <w:bottom w:w="0" w:type="dxa"/>
-          </w:tblCellMar>
-        </w:tblPrEx>
         <w:tc>
           <w:tcPr>
             <w:tcW w:w="2200" w:type="dxa"/>
@@ -7037,12 +6539,6 @@
         <w:gridCol w:w="6826"/>
       </w:tblGrid>
       <w:tr>
-        <w:tblPrEx>
-          <w:tblCellMar>
-            <w:top w:w="0" w:type="dxa"/>
-            <w:bottom w:w="0" w:type="dxa"/>
-          </w:tblCellMar>
-        </w:tblPrEx>
         <w:tc>
           <w:tcPr>
             <w:tcW w:w="2200" w:type="dxa"/>
@@ -7103,12 +6599,6 @@
         </w:tc>
       </w:tr>
       <w:tr>
-        <w:tblPrEx>
-          <w:tblCellMar>
-            <w:top w:w="0" w:type="dxa"/>
-            <w:bottom w:w="0" w:type="dxa"/>
-          </w:tblCellMar>
-        </w:tblPrEx>
         <w:tc>
           <w:tcPr>
             <w:tcW w:w="2200" w:type="dxa"/>
@@ -7169,12 +6659,6 @@
         </w:tc>
       </w:tr>
       <w:tr>
-        <w:tblPrEx>
-          <w:tblCellMar>
-            <w:top w:w="0" w:type="dxa"/>
-            <w:bottom w:w="0" w:type="dxa"/>
-          </w:tblCellMar>
-        </w:tblPrEx>
         <w:tc>
           <w:tcPr>
             <w:tcW w:w="2200" w:type="dxa"/>
@@ -7235,12 +6719,6 @@
         </w:tc>
       </w:tr>
       <w:tr>
-        <w:tblPrEx>
-          <w:tblCellMar>
-            <w:top w:w="0" w:type="dxa"/>
-            <w:bottom w:w="0" w:type="dxa"/>
-          </w:tblCellMar>
-        </w:tblPrEx>
         <w:tc>
           <w:tcPr>
             <w:tcW w:w="2200" w:type="dxa"/>
@@ -7301,12 +6779,6 @@
         </w:tc>
       </w:tr>
       <w:tr>
-        <w:tblPrEx>
-          <w:tblCellMar>
-            <w:top w:w="0" w:type="dxa"/>
-            <w:bottom w:w="0" w:type="dxa"/>
-          </w:tblCellMar>
-        </w:tblPrEx>
         <w:tc>
           <w:tcPr>
             <w:tcW w:w="2200" w:type="dxa"/>
@@ -7367,12 +6839,6 @@
         </w:tc>
       </w:tr>
       <w:tr>
-        <w:tblPrEx>
-          <w:tblCellMar>
-            <w:top w:w="0" w:type="dxa"/>
-            <w:bottom w:w="0" w:type="dxa"/>
-          </w:tblCellMar>
-        </w:tblPrEx>
         <w:tc>
           <w:tcPr>
             <w:tcW w:w="2200" w:type="dxa"/>
@@ -7433,12 +6899,6 @@
         </w:tc>
       </w:tr>
       <w:tr>
-        <w:tblPrEx>
-          <w:tblCellMar>
-            <w:top w:w="0" w:type="dxa"/>
-            <w:bottom w:w="0" w:type="dxa"/>
-          </w:tblCellMar>
-        </w:tblPrEx>
         <w:tc>
           <w:tcPr>
             <w:tcW w:w="2200" w:type="dxa"/>
@@ -7589,12 +7049,6 @@
         <w:gridCol w:w="1629"/>
       </w:tblGrid>
       <w:tr>
-        <w:tblPrEx>
-          <w:tblCellMar>
-            <w:top w:w="0" w:type="dxa"/>
-            <w:bottom w:w="0" w:type="dxa"/>
-          </w:tblCellMar>
-        </w:tblPrEx>
         <w:trPr>
           <w:tblHeader/>
         </w:trPr>
@@ -7780,12 +7234,6 @@
         </w:tc>
       </w:tr>
       <w:tr>
-        <w:tblPrEx>
-          <w:tblCellMar>
-            <w:top w:w="0" w:type="dxa"/>
-            <w:bottom w:w="0" w:type="dxa"/>
-          </w:tblCellMar>
-        </w:tblPrEx>
         <w:tc>
           <w:tcPr>
             <w:tcW w:w="1300" w:type="dxa"/>
@@ -7956,12 +7404,6 @@
         </w:tc>
       </w:tr>
       <w:tr>
-        <w:tblPrEx>
-          <w:tblCellMar>
-            <w:top w:w="0" w:type="dxa"/>
-            <w:bottom w:w="0" w:type="dxa"/>
-          </w:tblCellMar>
-        </w:tblPrEx>
         <w:tc>
           <w:tcPr>
             <w:tcW w:w="1300" w:type="dxa"/>
@@ -8132,12 +7574,6 @@
         </w:tc>
       </w:tr>
       <w:tr>
-        <w:tblPrEx>
-          <w:tblCellMar>
-            <w:top w:w="0" w:type="dxa"/>
-            <w:bottom w:w="0" w:type="dxa"/>
-          </w:tblCellMar>
-        </w:tblPrEx>
         <w:tc>
           <w:tcPr>
             <w:tcW w:w="1300" w:type="dxa"/>
@@ -8308,12 +7744,6 @@
         </w:tc>
       </w:tr>
       <w:tr>
-        <w:tblPrEx>
-          <w:tblCellMar>
-            <w:top w:w="0" w:type="dxa"/>
-            <w:bottom w:w="0" w:type="dxa"/>
-          </w:tblCellMar>
-        </w:tblPrEx>
         <w:tc>
           <w:tcPr>
             <w:tcW w:w="1300" w:type="dxa"/>
@@ -8484,12 +7914,6 @@
         </w:tc>
       </w:tr>
       <w:tr>
-        <w:tblPrEx>
-          <w:tblCellMar>
-            <w:top w:w="0" w:type="dxa"/>
-            <w:bottom w:w="0" w:type="dxa"/>
-          </w:tblCellMar>
-        </w:tblPrEx>
         <w:tc>
           <w:tcPr>
             <w:tcW w:w="1300" w:type="dxa"/>
@@ -8660,12 +8084,6 @@
         </w:tc>
       </w:tr>
       <w:tr>
-        <w:tblPrEx>
-          <w:tblCellMar>
-            <w:top w:w="0" w:type="dxa"/>
-            <w:bottom w:w="0" w:type="dxa"/>
-          </w:tblCellMar>
-        </w:tblPrEx>
         <w:tc>
           <w:tcPr>
             <w:tcW w:w="1300" w:type="dxa"/>
@@ -8836,12 +8254,6 @@
         </w:tc>
       </w:tr>
       <w:tr>
-        <w:tblPrEx>
-          <w:tblCellMar>
-            <w:top w:w="0" w:type="dxa"/>
-            <w:bottom w:w="0" w:type="dxa"/>
-          </w:tblCellMar>
-        </w:tblPrEx>
         <w:tc>
           <w:tcPr>
             <w:tcW w:w="1300" w:type="dxa"/>
@@ -9012,12 +8424,6 @@
         </w:tc>
       </w:tr>
       <w:tr>
-        <w:tblPrEx>
-          <w:tblCellMar>
-            <w:top w:w="0" w:type="dxa"/>
-            <w:bottom w:w="0" w:type="dxa"/>
-          </w:tblCellMar>
-        </w:tblPrEx>
         <w:tc>
           <w:tcPr>
             <w:tcW w:w="1300" w:type="dxa"/>
@@ -9188,12 +8594,6 @@
         </w:tc>
       </w:tr>
       <w:tr>
-        <w:tblPrEx>
-          <w:tblCellMar>
-            <w:top w:w="0" w:type="dxa"/>
-            <w:bottom w:w="0" w:type="dxa"/>
-          </w:tblCellMar>
-        </w:tblPrEx>
         <w:tc>
           <w:tcPr>
             <w:tcW w:w="1300" w:type="dxa"/>
@@ -9364,12 +8764,6 @@
         </w:tc>
       </w:tr>
       <w:tr>
-        <w:tblPrEx>
-          <w:tblCellMar>
-            <w:top w:w="0" w:type="dxa"/>
-            <w:bottom w:w="0" w:type="dxa"/>
-          </w:tblCellMar>
-        </w:tblPrEx>
         <w:tc>
           <w:tcPr>
             <w:tcW w:w="1300" w:type="dxa"/>
@@ -9541,12 +8935,6 @@
         </w:tc>
       </w:tr>
       <w:tr>
-        <w:tblPrEx>
-          <w:tblCellMar>
-            <w:top w:w="0" w:type="dxa"/>
-            <w:bottom w:w="0" w:type="dxa"/>
-          </w:tblCellMar>
-        </w:tblPrEx>
         <w:tc>
           <w:tcPr>
             <w:tcW w:w="1300" w:type="dxa"/>
@@ -9717,12 +9105,6 @@
         </w:tc>
       </w:tr>
       <w:tr>
-        <w:tblPrEx>
-          <w:tblCellMar>
-            <w:top w:w="0" w:type="dxa"/>
-            <w:bottom w:w="0" w:type="dxa"/>
-          </w:tblCellMar>
-        </w:tblPrEx>
         <w:tc>
           <w:tcPr>
             <w:tcW w:w="1300" w:type="dxa"/>
@@ -9893,12 +9275,6 @@
         </w:tc>
       </w:tr>
       <w:tr>
-        <w:tblPrEx>
-          <w:tblCellMar>
-            <w:top w:w="0" w:type="dxa"/>
-            <w:bottom w:w="0" w:type="dxa"/>
-          </w:tblCellMar>
-        </w:tblPrEx>
         <w:tc>
           <w:tcPr>
             <w:tcW w:w="1300" w:type="dxa"/>
@@ -10069,12 +9445,6 @@
         </w:tc>
       </w:tr>
       <w:tr>
-        <w:tblPrEx>
-          <w:tblCellMar>
-            <w:top w:w="0" w:type="dxa"/>
-            <w:bottom w:w="0" w:type="dxa"/>
-          </w:tblCellMar>
-        </w:tblPrEx>
         <w:tc>
           <w:tcPr>
             <w:tcW w:w="1300" w:type="dxa"/>
@@ -10245,12 +9615,6 @@
         </w:tc>
       </w:tr>
       <w:tr>
-        <w:tblPrEx>
-          <w:tblCellMar>
-            <w:top w:w="0" w:type="dxa"/>
-            <w:bottom w:w="0" w:type="dxa"/>
-          </w:tblCellMar>
-        </w:tblPrEx>
         <w:tc>
           <w:tcPr>
             <w:tcW w:w="1300" w:type="dxa"/>
@@ -10421,12 +9785,6 @@
         </w:tc>
       </w:tr>
       <w:tr>
-        <w:tblPrEx>
-          <w:tblCellMar>
-            <w:top w:w="0" w:type="dxa"/>
-            <w:bottom w:w="0" w:type="dxa"/>
-          </w:tblCellMar>
-        </w:tblPrEx>
         <w:tc>
           <w:tcPr>
             <w:tcW w:w="1300" w:type="dxa"/>
@@ -10597,12 +9955,6 @@
         </w:tc>
       </w:tr>
       <w:tr>
-        <w:tblPrEx>
-          <w:tblCellMar>
-            <w:top w:w="0" w:type="dxa"/>
-            <w:bottom w:w="0" w:type="dxa"/>
-          </w:tblCellMar>
-        </w:tblPrEx>
         <w:tc>
           <w:tcPr>
             <w:tcW w:w="1300" w:type="dxa"/>
@@ -10773,12 +10125,6 @@
         </w:tc>
       </w:tr>
       <w:tr>
-        <w:tblPrEx>
-          <w:tblCellMar>
-            <w:top w:w="0" w:type="dxa"/>
-            <w:bottom w:w="0" w:type="dxa"/>
-          </w:tblCellMar>
-        </w:tblPrEx>
         <w:tc>
           <w:tcPr>
             <w:tcW w:w="1300" w:type="dxa"/>
@@ -10949,12 +10295,6 @@
         </w:tc>
       </w:tr>
       <w:tr>
-        <w:tblPrEx>
-          <w:tblCellMar>
-            <w:top w:w="0" w:type="dxa"/>
-            <w:bottom w:w="0" w:type="dxa"/>
-          </w:tblCellMar>
-        </w:tblPrEx>
         <w:tc>
           <w:tcPr>
             <w:tcW w:w="1300" w:type="dxa"/>
@@ -11125,12 +10465,6 @@
         </w:tc>
       </w:tr>
       <w:tr>
-        <w:tblPrEx>
-          <w:tblCellMar>
-            <w:top w:w="0" w:type="dxa"/>
-            <w:bottom w:w="0" w:type="dxa"/>
-          </w:tblCellMar>
-        </w:tblPrEx>
         <w:tc>
           <w:tcPr>
             <w:tcW w:w="1300" w:type="dxa"/>
@@ -11301,12 +10635,6 @@
         </w:tc>
       </w:tr>
       <w:tr>
-        <w:tblPrEx>
-          <w:tblCellMar>
-            <w:top w:w="0" w:type="dxa"/>
-            <w:bottom w:w="0" w:type="dxa"/>
-          </w:tblCellMar>
-        </w:tblPrEx>
         <w:tc>
           <w:tcPr>
             <w:tcW w:w="1300" w:type="dxa"/>
@@ -11477,12 +10805,6 @@
         </w:tc>
       </w:tr>
       <w:tr>
-        <w:tblPrEx>
-          <w:tblCellMar>
-            <w:top w:w="0" w:type="dxa"/>
-            <w:bottom w:w="0" w:type="dxa"/>
-          </w:tblCellMar>
-        </w:tblPrEx>
         <w:tc>
           <w:tcPr>
             <w:tcW w:w="1300" w:type="dxa"/>
@@ -11654,12 +10976,6 @@
         </w:tc>
       </w:tr>
       <w:tr>
-        <w:tblPrEx>
-          <w:tblCellMar>
-            <w:top w:w="0" w:type="dxa"/>
-            <w:bottom w:w="0" w:type="dxa"/>
-          </w:tblCellMar>
-        </w:tblPrEx>
         <w:tc>
           <w:tcPr>
             <w:tcW w:w="1300" w:type="dxa"/>
@@ -11830,12 +11146,6 @@
         </w:tc>
       </w:tr>
       <w:tr>
-        <w:tblPrEx>
-          <w:tblCellMar>
-            <w:top w:w="0" w:type="dxa"/>
-            <w:bottom w:w="0" w:type="dxa"/>
-          </w:tblCellMar>
-        </w:tblPrEx>
         <w:tc>
           <w:tcPr>
             <w:tcW w:w="1300" w:type="dxa"/>
@@ -12006,12 +11316,6 @@
         </w:tc>
       </w:tr>
       <w:tr>
-        <w:tblPrEx>
-          <w:tblCellMar>
-            <w:top w:w="0" w:type="dxa"/>
-            <w:bottom w:w="0" w:type="dxa"/>
-          </w:tblCellMar>
-        </w:tblPrEx>
         <w:tc>
           <w:tcPr>
             <w:tcW w:w="1300" w:type="dxa"/>
@@ -12182,12 +11486,6 @@
         </w:tc>
       </w:tr>
       <w:tr>
-        <w:tblPrEx>
-          <w:tblCellMar>
-            <w:top w:w="0" w:type="dxa"/>
-            <w:bottom w:w="0" w:type="dxa"/>
-          </w:tblCellMar>
-        </w:tblPrEx>
         <w:tc>
           <w:tcPr>
             <w:tcW w:w="1300" w:type="dxa"/>
@@ -12358,12 +11656,6 @@
         </w:tc>
       </w:tr>
       <w:tr>
-        <w:tblPrEx>
-          <w:tblCellMar>
-            <w:top w:w="0" w:type="dxa"/>
-            <w:bottom w:w="0" w:type="dxa"/>
-          </w:tblCellMar>
-        </w:tblPrEx>
         <w:tc>
           <w:tcPr>
             <w:tcW w:w="1300" w:type="dxa"/>
@@ -12534,12 +11826,6 @@
         </w:tc>
       </w:tr>
       <w:tr>
-        <w:tblPrEx>
-          <w:tblCellMar>
-            <w:top w:w="0" w:type="dxa"/>
-            <w:bottom w:w="0" w:type="dxa"/>
-          </w:tblCellMar>
-        </w:tblPrEx>
         <w:tc>
           <w:tcPr>
             <w:tcW w:w="1300" w:type="dxa"/>
@@ -12710,12 +11996,6 @@
         </w:tc>
       </w:tr>
       <w:tr>
-        <w:tblPrEx>
-          <w:tblCellMar>
-            <w:top w:w="0" w:type="dxa"/>
-            <w:bottom w:w="0" w:type="dxa"/>
-          </w:tblCellMar>
-        </w:tblPrEx>
         <w:tc>
           <w:tcPr>
             <w:tcW w:w="1300" w:type="dxa"/>
@@ -12886,12 +12166,6 @@
         </w:tc>
       </w:tr>
       <w:tr>
-        <w:tblPrEx>
-          <w:tblCellMar>
-            <w:top w:w="0" w:type="dxa"/>
-            <w:bottom w:w="0" w:type="dxa"/>
-          </w:tblCellMar>
-        </w:tblPrEx>
         <w:tc>
           <w:tcPr>
             <w:tcW w:w="1300" w:type="dxa"/>
@@ -13062,12 +12336,6 @@
         </w:tc>
       </w:tr>
       <w:tr>
-        <w:tblPrEx>
-          <w:tblCellMar>
-            <w:top w:w="0" w:type="dxa"/>
-            <w:bottom w:w="0" w:type="dxa"/>
-          </w:tblCellMar>
-        </w:tblPrEx>
         <w:tc>
           <w:tcPr>
             <w:tcW w:w="1300" w:type="dxa"/>
@@ -13238,12 +12506,6 @@
         </w:tc>
       </w:tr>
       <w:tr>
-        <w:tblPrEx>
-          <w:tblCellMar>
-            <w:top w:w="0" w:type="dxa"/>
-            <w:bottom w:w="0" w:type="dxa"/>
-          </w:tblCellMar>
-        </w:tblPrEx>
         <w:tc>
           <w:tcPr>
             <w:tcW w:w="1300" w:type="dxa"/>
@@ -13414,12 +12676,6 @@
         </w:tc>
       </w:tr>
       <w:tr>
-        <w:tblPrEx>
-          <w:tblCellMar>
-            <w:top w:w="0" w:type="dxa"/>
-            <w:bottom w:w="0" w:type="dxa"/>
-          </w:tblCellMar>
-        </w:tblPrEx>
         <w:tc>
           <w:tcPr>
             <w:tcW w:w="1300" w:type="dxa"/>
@@ -13616,12 +12872,6 @@
         <w:gridCol w:w="9026"/>
       </w:tblGrid>
       <w:tr>
-        <w:tblPrEx>
-          <w:tblCellMar>
-            <w:top w:w="0" w:type="dxa"/>
-            <w:bottom w:w="0" w:type="dxa"/>
-          </w:tblCellMar>
-        </w:tblPrEx>
         <w:tc>
           <w:tcPr>
             <w:tcW w:w="0" w:type="auto"/>
@@ -13696,12 +12946,6 @@
         <w:gridCol w:w="5626"/>
       </w:tblGrid>
       <w:tr>
-        <w:tblPrEx>
-          <w:tblCellMar>
-            <w:top w:w="0" w:type="dxa"/>
-            <w:bottom w:w="0" w:type="dxa"/>
-          </w:tblCellMar>
-        </w:tblPrEx>
         <w:trPr>
           <w:tblHeader/>
         </w:trPr>
@@ -13767,12 +13011,6 @@
         </w:tc>
       </w:tr>
       <w:tr>
-        <w:tblPrEx>
-          <w:tblCellMar>
-            <w:top w:w="0" w:type="dxa"/>
-            <w:bottom w:w="0" w:type="dxa"/>
-          </w:tblCellMar>
-        </w:tblPrEx>
         <w:tc>
           <w:tcPr>
             <w:tcW w:w="3400" w:type="dxa"/>
@@ -13831,12 +13069,6 @@
         </w:tc>
       </w:tr>
       <w:tr>
-        <w:tblPrEx>
-          <w:tblCellMar>
-            <w:top w:w="0" w:type="dxa"/>
-            <w:bottom w:w="0" w:type="dxa"/>
-          </w:tblCellMar>
-        </w:tblPrEx>
         <w:tc>
           <w:tcPr>
             <w:tcW w:w="3400" w:type="dxa"/>
@@ -13895,12 +13127,6 @@
         </w:tc>
       </w:tr>
       <w:tr>
-        <w:tblPrEx>
-          <w:tblCellMar>
-            <w:top w:w="0" w:type="dxa"/>
-            <w:bottom w:w="0" w:type="dxa"/>
-          </w:tblCellMar>
-        </w:tblPrEx>
         <w:tc>
           <w:tcPr>
             <w:tcW w:w="3400" w:type="dxa"/>
@@ -13959,12 +13185,6 @@
         </w:tc>
       </w:tr>
       <w:tr>
-        <w:tblPrEx>
-          <w:tblCellMar>
-            <w:top w:w="0" w:type="dxa"/>
-            <w:bottom w:w="0" w:type="dxa"/>
-          </w:tblCellMar>
-        </w:tblPrEx>
         <w:tc>
           <w:tcPr>
             <w:tcW w:w="3400" w:type="dxa"/>
@@ -14023,12 +13243,6 @@
         </w:tc>
       </w:tr>
       <w:tr>
-        <w:tblPrEx>
-          <w:tblCellMar>
-            <w:top w:w="0" w:type="dxa"/>
-            <w:bottom w:w="0" w:type="dxa"/>
-          </w:tblCellMar>
-        </w:tblPrEx>
         <w:tc>
           <w:tcPr>
             <w:tcW w:w="3400" w:type="dxa"/>
@@ -14087,12 +13301,6 @@
         </w:tc>
       </w:tr>
       <w:tr>
-        <w:tblPrEx>
-          <w:tblCellMar>
-            <w:top w:w="0" w:type="dxa"/>
-            <w:bottom w:w="0" w:type="dxa"/>
-          </w:tblCellMar>
-        </w:tblPrEx>
         <w:tc>
           <w:tcPr>
             <w:tcW w:w="3400" w:type="dxa"/>
@@ -14151,12 +13359,6 @@
         </w:tc>
       </w:tr>
       <w:tr>
-        <w:tblPrEx>
-          <w:tblCellMar>
-            <w:top w:w="0" w:type="dxa"/>
-            <w:bottom w:w="0" w:type="dxa"/>
-          </w:tblCellMar>
-        </w:tblPrEx>
         <w:tc>
           <w:tcPr>
             <w:tcW w:w="3400" w:type="dxa"/>
@@ -14215,12 +13417,6 @@
         </w:tc>
       </w:tr>
       <w:tr>
-        <w:tblPrEx>
-          <w:tblCellMar>
-            <w:top w:w="0" w:type="dxa"/>
-            <w:bottom w:w="0" w:type="dxa"/>
-          </w:tblCellMar>
-        </w:tblPrEx>
         <w:tc>
           <w:tcPr>
             <w:tcW w:w="3400" w:type="dxa"/>
@@ -14279,12 +13475,6 @@
         </w:tc>
       </w:tr>
       <w:tr>
-        <w:tblPrEx>
-          <w:tblCellMar>
-            <w:top w:w="0" w:type="dxa"/>
-            <w:bottom w:w="0" w:type="dxa"/>
-          </w:tblCellMar>
-        </w:tblPrEx>
         <w:tc>
           <w:tcPr>
             <w:tcW w:w="3400" w:type="dxa"/>
@@ -14343,12 +13533,6 @@
         </w:tc>
       </w:tr>
       <w:tr>
-        <w:tblPrEx>
-          <w:tblCellMar>
-            <w:top w:w="0" w:type="dxa"/>
-            <w:bottom w:w="0" w:type="dxa"/>
-          </w:tblCellMar>
-        </w:tblPrEx>
         <w:tc>
           <w:tcPr>
             <w:tcW w:w="3400" w:type="dxa"/>
@@ -14407,12 +13591,6 @@
         </w:tc>
       </w:tr>
       <w:tr>
-        <w:tblPrEx>
-          <w:tblCellMar>
-            <w:top w:w="0" w:type="dxa"/>
-            <w:bottom w:w="0" w:type="dxa"/>
-          </w:tblCellMar>
-        </w:tblPrEx>
         <w:tc>
           <w:tcPr>
             <w:tcW w:w="3400" w:type="dxa"/>
@@ -14471,12 +13649,6 @@
         </w:tc>
       </w:tr>
       <w:tr>
-        <w:tblPrEx>
-          <w:tblCellMar>
-            <w:top w:w="0" w:type="dxa"/>
-            <w:bottom w:w="0" w:type="dxa"/>
-          </w:tblCellMar>
-        </w:tblPrEx>
         <w:tc>
           <w:tcPr>
             <w:tcW w:w="3400" w:type="dxa"/>
@@ -14535,12 +13707,6 @@
         </w:tc>
       </w:tr>
       <w:tr>
-        <w:tblPrEx>
-          <w:tblCellMar>
-            <w:top w:w="0" w:type="dxa"/>
-            <w:bottom w:w="0" w:type="dxa"/>
-          </w:tblCellMar>
-        </w:tblPrEx>
         <w:tc>
           <w:tcPr>
             <w:tcW w:w="3400" w:type="dxa"/>
@@ -14599,12 +13765,6 @@
         </w:tc>
       </w:tr>
       <w:tr>
-        <w:tblPrEx>
-          <w:tblCellMar>
-            <w:top w:w="0" w:type="dxa"/>
-            <w:bottom w:w="0" w:type="dxa"/>
-          </w:tblCellMar>
-        </w:tblPrEx>
         <w:tc>
           <w:tcPr>
             <w:tcW w:w="3400" w:type="dxa"/>
@@ -14663,12 +13823,6 @@
         </w:tc>
       </w:tr>
       <w:tr>
-        <w:tblPrEx>
-          <w:tblCellMar>
-            <w:top w:w="0" w:type="dxa"/>
-            <w:bottom w:w="0" w:type="dxa"/>
-          </w:tblCellMar>
-        </w:tblPrEx>
         <w:tc>
           <w:tcPr>
             <w:tcW w:w="3400" w:type="dxa"/>
@@ -14727,12 +13881,6 @@
         </w:tc>
       </w:tr>
       <w:tr>
-        <w:tblPrEx>
-          <w:tblCellMar>
-            <w:top w:w="0" w:type="dxa"/>
-            <w:bottom w:w="0" w:type="dxa"/>
-          </w:tblCellMar>
-        </w:tblPrEx>
         <w:tc>
           <w:tcPr>
             <w:tcW w:w="3400" w:type="dxa"/>
@@ -14791,12 +13939,6 @@
         </w:tc>
       </w:tr>
       <w:tr>
-        <w:tblPrEx>
-          <w:tblCellMar>
-            <w:top w:w="0" w:type="dxa"/>
-            <w:bottom w:w="0" w:type="dxa"/>
-          </w:tblCellMar>
-        </w:tblPrEx>
         <w:tc>
           <w:tcPr>
             <w:tcW w:w="3400" w:type="dxa"/>
@@ -14849,18 +13991,12 @@
                 <w:sz w:val="20"/>
                 <w:szCs w:val="20"/>
               </w:rPr>
-              <w:t>text-blue-600 hover:text-blue-900 (aussi text-indigo-600 pour commandes)</w:t>
+              <w:t>text-blue-600 hover:text-blue-900</w:t>
             </w:r>
           </w:p>
         </w:tc>
       </w:tr>
       <w:tr>
-        <w:tblPrEx>
-          <w:tblCellMar>
-            <w:top w:w="0" w:type="dxa"/>
-            <w:bottom w:w="0" w:type="dxa"/>
-          </w:tblCellMar>
-        </w:tblPrEx>
         <w:tc>
           <w:tcPr>
             <w:tcW w:w="3400" w:type="dxa"/>
@@ -14919,12 +14055,6 @@
         </w:tc>
       </w:tr>
       <w:tr>
-        <w:tblPrEx>
-          <w:tblCellMar>
-            <w:top w:w="0" w:type="dxa"/>
-            <w:bottom w:w="0" w:type="dxa"/>
-          </w:tblCellMar>
-        </w:tblPrEx>
         <w:tc>
           <w:tcPr>
             <w:tcW w:w="3400" w:type="dxa"/>
@@ -14983,12 +14113,6 @@
         </w:tc>
       </w:tr>
       <w:tr>
-        <w:tblPrEx>
-          <w:tblCellMar>
-            <w:top w:w="0" w:type="dxa"/>
-            <w:bottom w:w="0" w:type="dxa"/>
-          </w:tblCellMar>
-        </w:tblPrEx>
         <w:tc>
           <w:tcPr>
             <w:tcW w:w="3400" w:type="dxa"/>
@@ -15047,12 +14171,6 @@
         </w:tc>
       </w:tr>
       <w:tr>
-        <w:tblPrEx>
-          <w:tblCellMar>
-            <w:top w:w="0" w:type="dxa"/>
-            <w:bottom w:w="0" w:type="dxa"/>
-          </w:tblCellMar>
-        </w:tblPrEx>
         <w:tc>
           <w:tcPr>
             <w:tcW w:w="3400" w:type="dxa"/>
@@ -15111,12 +14229,6 @@
         </w:tc>
       </w:tr>
       <w:tr>
-        <w:tblPrEx>
-          <w:tblCellMar>
-            <w:top w:w="0" w:type="dxa"/>
-            <w:bottom w:w="0" w:type="dxa"/>
-          </w:tblCellMar>
-        </w:tblPrEx>
         <w:tc>
           <w:tcPr>
             <w:tcW w:w="3400" w:type="dxa"/>
@@ -15175,12 +14287,6 @@
         </w:tc>
       </w:tr>
       <w:tr>
-        <w:tblPrEx>
-          <w:tblCellMar>
-            <w:top w:w="0" w:type="dxa"/>
-            <w:bottom w:w="0" w:type="dxa"/>
-          </w:tblCellMar>
-        </w:tblPrEx>
         <w:tc>
           <w:tcPr>
             <w:tcW w:w="3400" w:type="dxa"/>
@@ -15239,12 +14345,6 @@
         </w:tc>
       </w:tr>
       <w:tr>
-        <w:tblPrEx>
-          <w:tblCellMar>
-            <w:top w:w="0" w:type="dxa"/>
-            <w:bottom w:w="0" w:type="dxa"/>
-          </w:tblCellMar>
-        </w:tblPrEx>
         <w:tc>
           <w:tcPr>
             <w:tcW w:w="3400" w:type="dxa"/>
@@ -15303,12 +14403,6 @@
         </w:tc>
       </w:tr>
       <w:tr>
-        <w:tblPrEx>
-          <w:tblCellMar>
-            <w:top w:w="0" w:type="dxa"/>
-            <w:bottom w:w="0" w:type="dxa"/>
-          </w:tblCellMar>
-        </w:tblPrEx>
         <w:tc>
           <w:tcPr>
             <w:tcW w:w="3400" w:type="dxa"/>
@@ -15402,12 +14496,6 @@
         <w:gridCol w:w="9026"/>
       </w:tblGrid>
       <w:tr>
-        <w:tblPrEx>
-          <w:tblCellMar>
-            <w:top w:w="0" w:type="dxa"/>
-            <w:bottom w:w="0" w:type="dxa"/>
-          </w:tblCellMar>
-        </w:tblPrEx>
         <w:tc>
           <w:tcPr>
             <w:tcW w:w="0" w:type="auto"/>
@@ -15945,12 +15033,6 @@
         <w:gridCol w:w="2300"/>
       </w:tblGrid>
       <w:tr>
-        <w:tblPrEx>
-          <w:tblCellMar>
-            <w:top w:w="0" w:type="dxa"/>
-            <w:bottom w:w="0" w:type="dxa"/>
-          </w:tblCellMar>
-        </w:tblPrEx>
         <w:trPr>
           <w:tblHeader/>
         </w:trPr>
@@ -16046,12 +15128,6 @@
         </w:tc>
       </w:tr>
       <w:tr>
-        <w:tblPrEx>
-          <w:tblCellMar>
-            <w:top w:w="0" w:type="dxa"/>
-            <w:bottom w:w="0" w:type="dxa"/>
-          </w:tblCellMar>
-        </w:tblPrEx>
         <w:tc>
           <w:tcPr>
             <w:tcW w:w="900" w:type="dxa"/>
@@ -16138,12 +15214,6 @@
         </w:tc>
       </w:tr>
       <w:tr>
-        <w:tblPrEx>
-          <w:tblCellMar>
-            <w:top w:w="0" w:type="dxa"/>
-            <w:bottom w:w="0" w:type="dxa"/>
-          </w:tblCellMar>
-        </w:tblPrEx>
         <w:tc>
           <w:tcPr>
             <w:tcW w:w="900" w:type="dxa"/>
@@ -16230,12 +15300,6 @@
         </w:tc>
       </w:tr>
       <w:tr>
-        <w:tblPrEx>
-          <w:tblCellMar>
-            <w:top w:w="0" w:type="dxa"/>
-            <w:bottom w:w="0" w:type="dxa"/>
-          </w:tblCellMar>
-        </w:tblPrEx>
         <w:tc>
           <w:tcPr>
             <w:tcW w:w="900" w:type="dxa"/>
@@ -16322,12 +15386,6 @@
         </w:tc>
       </w:tr>
       <w:tr>
-        <w:tblPrEx>
-          <w:tblCellMar>
-            <w:top w:w="0" w:type="dxa"/>
-            <w:bottom w:w="0" w:type="dxa"/>
-          </w:tblCellMar>
-        </w:tblPrEx>
         <w:tc>
           <w:tcPr>
             <w:tcW w:w="900" w:type="dxa"/>
@@ -16414,12 +15472,6 @@
         </w:tc>
       </w:tr>
       <w:tr>
-        <w:tblPrEx>
-          <w:tblCellMar>
-            <w:top w:w="0" w:type="dxa"/>
-            <w:bottom w:w="0" w:type="dxa"/>
-          </w:tblCellMar>
-        </w:tblPrEx>
         <w:tc>
           <w:tcPr>
             <w:tcW w:w="900" w:type="dxa"/>
@@ -16506,12 +15558,6 @@
         </w:tc>
       </w:tr>
       <w:tr>
-        <w:tblPrEx>
-          <w:tblCellMar>
-            <w:top w:w="0" w:type="dxa"/>
-            <w:bottom w:w="0" w:type="dxa"/>
-          </w:tblCellMar>
-        </w:tblPrEx>
         <w:tc>
           <w:tcPr>
             <w:tcW w:w="900" w:type="dxa"/>
@@ -16598,12 +15644,6 @@
         </w:tc>
       </w:tr>
       <w:tr>
-        <w:tblPrEx>
-          <w:tblCellMar>
-            <w:top w:w="0" w:type="dxa"/>
-            <w:bottom w:w="0" w:type="dxa"/>
-          </w:tblCellMar>
-        </w:tblPrEx>
         <w:tc>
           <w:tcPr>
             <w:tcW w:w="900" w:type="dxa"/>
@@ -16690,12 +15730,6 @@
         </w:tc>
       </w:tr>
       <w:tr>
-        <w:tblPrEx>
-          <w:tblCellMar>
-            <w:top w:w="0" w:type="dxa"/>
-            <w:bottom w:w="0" w:type="dxa"/>
-          </w:tblCellMar>
-        </w:tblPrEx>
         <w:tc>
           <w:tcPr>
             <w:tcW w:w="900" w:type="dxa"/>
@@ -16782,12 +15816,6 @@
         </w:tc>
       </w:tr>
       <w:tr>
-        <w:tblPrEx>
-          <w:tblCellMar>
-            <w:top w:w="0" w:type="dxa"/>
-            <w:bottom w:w="0" w:type="dxa"/>
-          </w:tblCellMar>
-        </w:tblPrEx>
         <w:tc>
           <w:tcPr>
             <w:tcW w:w="900" w:type="dxa"/>
@@ -16874,12 +15902,6 @@
         </w:tc>
       </w:tr>
       <w:tr>
-        <w:tblPrEx>
-          <w:tblCellMar>
-            <w:top w:w="0" w:type="dxa"/>
-            <w:bottom w:w="0" w:type="dxa"/>
-          </w:tblCellMar>
-        </w:tblPrEx>
         <w:tc>
           <w:tcPr>
             <w:tcW w:w="900" w:type="dxa"/>
@@ -16966,12 +15988,6 @@
         </w:tc>
       </w:tr>
       <w:tr>
-        <w:tblPrEx>
-          <w:tblCellMar>
-            <w:top w:w="0" w:type="dxa"/>
-            <w:bottom w:w="0" w:type="dxa"/>
-          </w:tblCellMar>
-        </w:tblPrEx>
         <w:tc>
           <w:tcPr>
             <w:tcW w:w="900" w:type="dxa"/>
@@ -17058,12 +16074,6 @@
         </w:tc>
       </w:tr>
       <w:tr>
-        <w:tblPrEx>
-          <w:tblCellMar>
-            <w:top w:w="0" w:type="dxa"/>
-            <w:bottom w:w="0" w:type="dxa"/>
-          </w:tblCellMar>
-        </w:tblPrEx>
         <w:tc>
           <w:tcPr>
             <w:tcW w:w="900" w:type="dxa"/>
@@ -17150,12 +16160,6 @@
         </w:tc>
       </w:tr>
       <w:tr>
-        <w:tblPrEx>
-          <w:tblCellMar>
-            <w:top w:w="0" w:type="dxa"/>
-            <w:bottom w:w="0" w:type="dxa"/>
-          </w:tblCellMar>
-        </w:tblPrEx>
         <w:tc>
           <w:tcPr>
             <w:tcW w:w="900" w:type="dxa"/>
@@ -17242,12 +16246,6 @@
         </w:tc>
       </w:tr>
       <w:tr>
-        <w:tblPrEx>
-          <w:tblCellMar>
-            <w:top w:w="0" w:type="dxa"/>
-            <w:bottom w:w="0" w:type="dxa"/>
-          </w:tblCellMar>
-        </w:tblPrEx>
         <w:tc>
           <w:tcPr>
             <w:tcW w:w="900" w:type="dxa"/>
@@ -17334,12 +16332,6 @@
         </w:tc>
       </w:tr>
       <w:tr>
-        <w:tblPrEx>
-          <w:tblCellMar>
-            <w:top w:w="0" w:type="dxa"/>
-            <w:bottom w:w="0" w:type="dxa"/>
-          </w:tblCellMar>
-        </w:tblPrEx>
         <w:tc>
           <w:tcPr>
             <w:tcW w:w="900" w:type="dxa"/>
@@ -17426,12 +16418,6 @@
         </w:tc>
       </w:tr>
       <w:tr>
-        <w:tblPrEx>
-          <w:tblCellMar>
-            <w:top w:w="0" w:type="dxa"/>
-            <w:bottom w:w="0" w:type="dxa"/>
-          </w:tblCellMar>
-        </w:tblPrEx>
         <w:tc>
           <w:tcPr>
             <w:tcW w:w="900" w:type="dxa"/>
@@ -17518,12 +16504,6 @@
         </w:tc>
       </w:tr>
       <w:tr>
-        <w:tblPrEx>
-          <w:tblCellMar>
-            <w:top w:w="0" w:type="dxa"/>
-            <w:bottom w:w="0" w:type="dxa"/>
-          </w:tblCellMar>
-        </w:tblPrEx>
         <w:tc>
           <w:tcPr>
             <w:tcW w:w="900" w:type="dxa"/>
@@ -17611,12 +16591,6 @@
         </w:tc>
       </w:tr>
       <w:tr>
-        <w:tblPrEx>
-          <w:tblCellMar>
-            <w:top w:w="0" w:type="dxa"/>
-            <w:bottom w:w="0" w:type="dxa"/>
-          </w:tblCellMar>
-        </w:tblPrEx>
         <w:tc>
           <w:tcPr>
             <w:tcW w:w="900" w:type="dxa"/>
@@ -18352,12 +17326,6 @@
         <w:gridCol w:w="9026"/>
       </w:tblGrid>
       <w:tr>
-        <w:tblPrEx>
-          <w:tblCellMar>
-            <w:top w:w="0" w:type="dxa"/>
-            <w:bottom w:w="0" w:type="dxa"/>
-          </w:tblCellMar>
-        </w:tblPrEx>
         <w:tc>
           <w:tcPr>
             <w:tcW w:w="0" w:type="auto"/>
@@ -18444,12 +17412,6 @@
         <w:gridCol w:w="9026"/>
       </w:tblGrid>
       <w:tr>
-        <w:tblPrEx>
-          <w:tblCellMar>
-            <w:top w:w="0" w:type="dxa"/>
-            <w:bottom w:w="0" w:type="dxa"/>
-          </w:tblCellMar>
-        </w:tblPrEx>
         <w:tc>
           <w:tcPr>
             <w:tcW w:w="0" w:type="auto"/>
@@ -18894,12 +17856,6 @@
         <w:gridCol w:w="2853"/>
       </w:tblGrid>
       <w:tr>
-        <w:tblPrEx>
-          <w:tblCellMar>
-            <w:top w:w="0" w:type="dxa"/>
-            <w:bottom w:w="0" w:type="dxa"/>
-          </w:tblCellMar>
-        </w:tblPrEx>
         <w:trPr>
           <w:tblHeader/>
         </w:trPr>
@@ -19055,12 +18011,6 @@
         </w:tc>
       </w:tr>
       <w:tr>
-        <w:tblPrEx>
-          <w:tblCellMar>
-            <w:top w:w="0" w:type="dxa"/>
-            <w:bottom w:w="0" w:type="dxa"/>
-          </w:tblCellMar>
-        </w:tblPrEx>
         <w:tc>
           <w:tcPr>
             <w:tcW w:w="2600" w:type="dxa"/>
@@ -19203,12 +18153,6 @@
         </w:tc>
       </w:tr>
       <w:tr>
-        <w:tblPrEx>
-          <w:tblCellMar>
-            <w:top w:w="0" w:type="dxa"/>
-            <w:bottom w:w="0" w:type="dxa"/>
-          </w:tblCellMar>
-        </w:tblPrEx>
         <w:tc>
           <w:tcPr>
             <w:tcW w:w="2600" w:type="dxa"/>
@@ -19351,12 +18295,6 @@
         </w:tc>
       </w:tr>
       <w:tr>
-        <w:tblPrEx>
-          <w:tblCellMar>
-            <w:top w:w="0" w:type="dxa"/>
-            <w:bottom w:w="0" w:type="dxa"/>
-          </w:tblCellMar>
-        </w:tblPrEx>
         <w:tc>
           <w:tcPr>
             <w:tcW w:w="2600" w:type="dxa"/>
@@ -19499,12 +18437,6 @@
         </w:tc>
       </w:tr>
       <w:tr>
-        <w:tblPrEx>
-          <w:tblCellMar>
-            <w:top w:w="0" w:type="dxa"/>
-            <w:bottom w:w="0" w:type="dxa"/>
-          </w:tblCellMar>
-        </w:tblPrEx>
         <w:tc>
           <w:tcPr>
             <w:tcW w:w="2600" w:type="dxa"/>
@@ -19647,12 +18579,6 @@
         </w:tc>
       </w:tr>
       <w:tr>
-        <w:tblPrEx>
-          <w:tblCellMar>
-            <w:top w:w="0" w:type="dxa"/>
-            <w:bottom w:w="0" w:type="dxa"/>
-          </w:tblCellMar>
-        </w:tblPrEx>
         <w:tc>
           <w:tcPr>
             <w:tcW w:w="2600" w:type="dxa"/>
@@ -19795,12 +18721,6 @@
         </w:tc>
       </w:tr>
       <w:tr>
-        <w:tblPrEx>
-          <w:tblCellMar>
-            <w:top w:w="0" w:type="dxa"/>
-            <w:bottom w:w="0" w:type="dxa"/>
-          </w:tblCellMar>
-        </w:tblPrEx>
         <w:tc>
           <w:tcPr>
             <w:tcW w:w="2600" w:type="dxa"/>
@@ -19943,12 +18863,6 @@
         </w:tc>
       </w:tr>
       <w:tr>
-        <w:tblPrEx>
-          <w:tblCellMar>
-            <w:top w:w="0" w:type="dxa"/>
-            <w:bottom w:w="0" w:type="dxa"/>
-          </w:tblCellMar>
-        </w:tblPrEx>
         <w:tc>
           <w:tcPr>
             <w:tcW w:w="2600" w:type="dxa"/>
@@ -20091,12 +19005,6 @@
         </w:tc>
       </w:tr>
       <w:tr>
-        <w:tblPrEx>
-          <w:tblCellMar>
-            <w:top w:w="0" w:type="dxa"/>
-            <w:bottom w:w="0" w:type="dxa"/>
-          </w:tblCellMar>
-        </w:tblPrEx>
         <w:tc>
           <w:tcPr>
             <w:tcW w:w="2600" w:type="dxa"/>
@@ -20239,12 +19147,6 @@
         </w:tc>
       </w:tr>
       <w:tr>
-        <w:tblPrEx>
-          <w:tblCellMar>
-            <w:top w:w="0" w:type="dxa"/>
-            <w:bottom w:w="0" w:type="dxa"/>
-          </w:tblCellMar>
-        </w:tblPrEx>
         <w:tc>
           <w:tcPr>
             <w:tcW w:w="2600" w:type="dxa"/>
@@ -20387,12 +19289,6 @@
         </w:tc>
       </w:tr>
       <w:tr>
-        <w:tblPrEx>
-          <w:tblCellMar>
-            <w:top w:w="0" w:type="dxa"/>
-            <w:bottom w:w="0" w:type="dxa"/>
-          </w:tblCellMar>
-        </w:tblPrEx>
         <w:tc>
           <w:tcPr>
             <w:tcW w:w="2600" w:type="dxa"/>
@@ -20535,12 +19431,6 @@
         </w:tc>
       </w:tr>
       <w:tr>
-        <w:tblPrEx>
-          <w:tblCellMar>
-            <w:top w:w="0" w:type="dxa"/>
-            <w:bottom w:w="0" w:type="dxa"/>
-          </w:tblCellMar>
-        </w:tblPrEx>
         <w:tc>
           <w:tcPr>
             <w:tcW w:w="2600" w:type="dxa"/>
@@ -20683,12 +19573,6 @@
         </w:tc>
       </w:tr>
       <w:tr>
-        <w:tblPrEx>
-          <w:tblCellMar>
-            <w:top w:w="0" w:type="dxa"/>
-            <w:bottom w:w="0" w:type="dxa"/>
-          </w:tblCellMar>
-        </w:tblPrEx>
         <w:tc>
           <w:tcPr>
             <w:tcW w:w="2600" w:type="dxa"/>
@@ -20831,12 +19715,6 @@
         </w:tc>
       </w:tr>
       <w:tr>
-        <w:tblPrEx>
-          <w:tblCellMar>
-            <w:top w:w="0" w:type="dxa"/>
-            <w:bottom w:w="0" w:type="dxa"/>
-          </w:tblCellMar>
-        </w:tblPrEx>
         <w:tc>
           <w:tcPr>
             <w:tcW w:w="2600" w:type="dxa"/>
@@ -20979,12 +19857,6 @@
         </w:tc>
       </w:tr>
       <w:tr>
-        <w:tblPrEx>
-          <w:tblCellMar>
-            <w:top w:w="0" w:type="dxa"/>
-            <w:bottom w:w="0" w:type="dxa"/>
-          </w:tblCellMar>
-        </w:tblPrEx>
         <w:tc>
           <w:tcPr>
             <w:tcW w:w="2600" w:type="dxa"/>
@@ -21127,12 +19999,6 @@
         </w:tc>
       </w:tr>
       <w:tr>
-        <w:tblPrEx>
-          <w:tblCellMar>
-            <w:top w:w="0" w:type="dxa"/>
-            <w:bottom w:w="0" w:type="dxa"/>
-          </w:tblCellMar>
-        </w:tblPrEx>
         <w:tc>
           <w:tcPr>
             <w:tcW w:w="2600" w:type="dxa"/>
@@ -21275,12 +20141,6 @@
         </w:tc>
       </w:tr>
       <w:tr>
-        <w:tblPrEx>
-          <w:tblCellMar>
-            <w:top w:w="0" w:type="dxa"/>
-            <w:bottom w:w="0" w:type="dxa"/>
-          </w:tblCellMar>
-        </w:tblPrEx>
         <w:tc>
           <w:tcPr>
             <w:tcW w:w="2600" w:type="dxa"/>
@@ -21423,12 +20283,6 @@
         </w:tc>
       </w:tr>
       <w:tr>
-        <w:tblPrEx>
-          <w:tblCellMar>
-            <w:top w:w="0" w:type="dxa"/>
-            <w:bottom w:w="0" w:type="dxa"/>
-          </w:tblCellMar>
-        </w:tblPrEx>
         <w:tc>
           <w:tcPr>
             <w:tcW w:w="2600" w:type="dxa"/>
@@ -21572,12 +20426,6 @@
         </w:tc>
       </w:tr>
       <w:tr>
-        <w:tblPrEx>
-          <w:tblCellMar>
-            <w:top w:w="0" w:type="dxa"/>
-            <w:bottom w:w="0" w:type="dxa"/>
-          </w:tblCellMar>
-        </w:tblPrEx>
         <w:tc>
           <w:tcPr>
             <w:tcW w:w="2600" w:type="dxa"/>
@@ -21720,12 +20568,6 @@
         </w:tc>
       </w:tr>
       <w:tr>
-        <w:tblPrEx>
-          <w:tblCellMar>
-            <w:top w:w="0" w:type="dxa"/>
-            <w:bottom w:w="0" w:type="dxa"/>
-          </w:tblCellMar>
-        </w:tblPrEx>
         <w:tc>
           <w:tcPr>
             <w:tcW w:w="2600" w:type="dxa"/>
@@ -21868,12 +20710,6 @@
         </w:tc>
       </w:tr>
       <w:tr>
-        <w:tblPrEx>
-          <w:tblCellMar>
-            <w:top w:w="0" w:type="dxa"/>
-            <w:bottom w:w="0" w:type="dxa"/>
-          </w:tblCellMar>
-        </w:tblPrEx>
         <w:tc>
           <w:tcPr>
             <w:tcW w:w="2600" w:type="dxa"/>
@@ -22016,12 +20852,6 @@
         </w:tc>
       </w:tr>
       <w:tr>
-        <w:tblPrEx>
-          <w:tblCellMar>
-            <w:top w:w="0" w:type="dxa"/>
-            <w:bottom w:w="0" w:type="dxa"/>
-          </w:tblCellMar>
-        </w:tblPrEx>
         <w:tc>
           <w:tcPr>
             <w:tcW w:w="2600" w:type="dxa"/>
@@ -22164,12 +20994,6 @@
         </w:tc>
       </w:tr>
       <w:tr>
-        <w:tblPrEx>
-          <w:tblCellMar>
-            <w:top w:w="0" w:type="dxa"/>
-            <w:bottom w:w="0" w:type="dxa"/>
-          </w:tblCellMar>
-        </w:tblPrEx>
         <w:tc>
           <w:tcPr>
             <w:tcW w:w="2600" w:type="dxa"/>
@@ -22312,12 +21136,6 @@
         </w:tc>
       </w:tr>
       <w:tr>
-        <w:tblPrEx>
-          <w:tblCellMar>
-            <w:top w:w="0" w:type="dxa"/>
-            <w:bottom w:w="0" w:type="dxa"/>
-          </w:tblCellMar>
-        </w:tblPrEx>
         <w:tc>
           <w:tcPr>
             <w:tcW w:w="2600" w:type="dxa"/>
@@ -22460,12 +21278,6 @@
         </w:tc>
       </w:tr>
       <w:tr>
-        <w:tblPrEx>
-          <w:tblCellMar>
-            <w:top w:w="0" w:type="dxa"/>
-            <w:bottom w:w="0" w:type="dxa"/>
-          </w:tblCellMar>
-        </w:tblPrEx>
         <w:tc>
           <w:tcPr>
             <w:tcW w:w="2600" w:type="dxa"/>
@@ -22608,12 +21420,6 @@
         </w:tc>
       </w:tr>
       <w:tr>
-        <w:tblPrEx>
-          <w:tblCellMar>
-            <w:top w:w="0" w:type="dxa"/>
-            <w:bottom w:w="0" w:type="dxa"/>
-          </w:tblCellMar>
-        </w:tblPrEx>
         <w:tc>
           <w:tcPr>
             <w:tcW w:w="2600" w:type="dxa"/>
@@ -22756,12 +21562,6 @@
         </w:tc>
       </w:tr>
       <w:tr>
-        <w:tblPrEx>
-          <w:tblCellMar>
-            <w:top w:w="0" w:type="dxa"/>
-            <w:bottom w:w="0" w:type="dxa"/>
-          </w:tblCellMar>
-        </w:tblPrEx>
         <w:tc>
           <w:tcPr>
             <w:tcW w:w="2600" w:type="dxa"/>
@@ -22904,12 +21704,6 @@
         </w:tc>
       </w:tr>
       <w:tr>
-        <w:tblPrEx>
-          <w:tblCellMar>
-            <w:top w:w="0" w:type="dxa"/>
-            <w:bottom w:w="0" w:type="dxa"/>
-          </w:tblCellMar>
-        </w:tblPrEx>
         <w:tc>
           <w:tcPr>
             <w:tcW w:w="2600" w:type="dxa"/>
@@ -23052,12 +21846,6 @@
         </w:tc>
       </w:tr>
       <w:tr>
-        <w:tblPrEx>
-          <w:tblCellMar>
-            <w:top w:w="0" w:type="dxa"/>
-            <w:bottom w:w="0" w:type="dxa"/>
-          </w:tblCellMar>
-        </w:tblPrEx>
         <w:tc>
           <w:tcPr>
             <w:tcW w:w="2600" w:type="dxa"/>
@@ -23200,12 +21988,6 @@
         </w:tc>
       </w:tr>
       <w:tr>
-        <w:tblPrEx>
-          <w:tblCellMar>
-            <w:top w:w="0" w:type="dxa"/>
-            <w:bottom w:w="0" w:type="dxa"/>
-          </w:tblCellMar>
-        </w:tblPrEx>
         <w:tc>
           <w:tcPr>
             <w:tcW w:w="2600" w:type="dxa"/>
@@ -23348,12 +22130,6 @@
         </w:tc>
       </w:tr>
       <w:tr>
-        <w:tblPrEx>
-          <w:tblCellMar>
-            <w:top w:w="0" w:type="dxa"/>
-            <w:bottom w:w="0" w:type="dxa"/>
-          </w:tblCellMar>
-        </w:tblPrEx>
         <w:tc>
           <w:tcPr>
             <w:tcW w:w="2600" w:type="dxa"/>
@@ -23496,12 +22272,6 @@
         </w:tc>
       </w:tr>
       <w:tr>
-        <w:tblPrEx>
-          <w:tblCellMar>
-            <w:top w:w="0" w:type="dxa"/>
-            <w:bottom w:w="0" w:type="dxa"/>
-          </w:tblCellMar>
-        </w:tblPrEx>
         <w:tc>
           <w:tcPr>
             <w:tcW w:w="2600" w:type="dxa"/>
@@ -23644,12 +22414,6 @@
         </w:tc>
       </w:tr>
       <w:tr>
-        <w:tblPrEx>
-          <w:tblCellMar>
-            <w:top w:w="0" w:type="dxa"/>
-            <w:bottom w:w="0" w:type="dxa"/>
-          </w:tblCellMar>
-        </w:tblPrEx>
         <w:tc>
           <w:tcPr>
             <w:tcW w:w="2600" w:type="dxa"/>
@@ -23792,12 +22556,6 @@
         </w:tc>
       </w:tr>
       <w:tr>
-        <w:tblPrEx>
-          <w:tblCellMar>
-            <w:top w:w="0" w:type="dxa"/>
-            <w:bottom w:w="0" w:type="dxa"/>
-          </w:tblCellMar>
-        </w:tblPrEx>
         <w:tc>
           <w:tcPr>
             <w:tcW w:w="2600" w:type="dxa"/>
@@ -23940,12 +22698,6 @@
         </w:tc>
       </w:tr>
       <w:tr>
-        <w:tblPrEx>
-          <w:tblCellMar>
-            <w:top w:w="0" w:type="dxa"/>
-            <w:bottom w:w="0" w:type="dxa"/>
-          </w:tblCellMar>
-        </w:tblPrEx>
         <w:tc>
           <w:tcPr>
             <w:tcW w:w="2600" w:type="dxa"/>
@@ -24089,12 +22841,6 @@
         </w:tc>
       </w:tr>
       <w:tr>
-        <w:tblPrEx>
-          <w:tblCellMar>
-            <w:top w:w="0" w:type="dxa"/>
-            <w:bottom w:w="0" w:type="dxa"/>
-          </w:tblCellMar>
-        </w:tblPrEx>
         <w:tc>
           <w:tcPr>
             <w:tcW w:w="2600" w:type="dxa"/>
@@ -24237,12 +22983,6 @@
         </w:tc>
       </w:tr>
       <w:tr>
-        <w:tblPrEx>
-          <w:tblCellMar>
-            <w:top w:w="0" w:type="dxa"/>
-            <w:bottom w:w="0" w:type="dxa"/>
-          </w:tblCellMar>
-        </w:tblPrEx>
         <w:tc>
           <w:tcPr>
             <w:tcW w:w="2600" w:type="dxa"/>
@@ -24385,12 +23125,6 @@
         </w:tc>
       </w:tr>
       <w:tr>
-        <w:tblPrEx>
-          <w:tblCellMar>
-            <w:top w:w="0" w:type="dxa"/>
-            <w:bottom w:w="0" w:type="dxa"/>
-          </w:tblCellMar>
-        </w:tblPrEx>
         <w:tc>
           <w:tcPr>
             <w:tcW w:w="2600" w:type="dxa"/>
@@ -24533,12 +23267,6 @@
         </w:tc>
       </w:tr>
       <w:tr>
-        <w:tblPrEx>
-          <w:tblCellMar>
-            <w:top w:w="0" w:type="dxa"/>
-            <w:bottom w:w="0" w:type="dxa"/>
-          </w:tblCellMar>
-        </w:tblPrEx>
         <w:tc>
           <w:tcPr>
             <w:tcW w:w="2600" w:type="dxa"/>
@@ -24681,12 +23409,6 @@
         </w:tc>
       </w:tr>
       <w:tr>
-        <w:tblPrEx>
-          <w:tblCellMar>
-            <w:top w:w="0" w:type="dxa"/>
-            <w:bottom w:w="0" w:type="dxa"/>
-          </w:tblCellMar>
-        </w:tblPrEx>
         <w:tc>
           <w:tcPr>
             <w:tcW w:w="2600" w:type="dxa"/>
@@ -24829,12 +23551,6 @@
         </w:tc>
       </w:tr>
       <w:tr>
-        <w:tblPrEx>
-          <w:tblCellMar>
-            <w:top w:w="0" w:type="dxa"/>
-            <w:bottom w:w="0" w:type="dxa"/>
-          </w:tblCellMar>
-        </w:tblPrEx>
         <w:tc>
           <w:tcPr>
             <w:tcW w:w="2600" w:type="dxa"/>
@@ -25013,12 +23729,6 @@
         <w:gridCol w:w="6426"/>
       </w:tblGrid>
       <w:tr>
-        <w:tblPrEx>
-          <w:tblCellMar>
-            <w:top w:w="0" w:type="dxa"/>
-            <w:bottom w:w="0" w:type="dxa"/>
-          </w:tblCellMar>
-        </w:tblPrEx>
         <w:trPr>
           <w:tblHeader/>
         </w:trPr>
@@ -25084,12 +23794,6 @@
         </w:tc>
       </w:tr>
       <w:tr>
-        <w:tblPrEx>
-          <w:tblCellMar>
-            <w:top w:w="0" w:type="dxa"/>
-            <w:bottom w:w="0" w:type="dxa"/>
-          </w:tblCellMar>
-        </w:tblPrEx>
         <w:tc>
           <w:tcPr>
             <w:tcW w:w="2600" w:type="dxa"/>
@@ -25148,12 +23852,6 @@
         </w:tc>
       </w:tr>
       <w:tr>
-        <w:tblPrEx>
-          <w:tblCellMar>
-            <w:top w:w="0" w:type="dxa"/>
-            <w:bottom w:w="0" w:type="dxa"/>
-          </w:tblCellMar>
-        </w:tblPrEx>
         <w:tc>
           <w:tcPr>
             <w:tcW w:w="2600" w:type="dxa"/>
@@ -25212,12 +23910,6 @@
         </w:tc>
       </w:tr>
       <w:tr>
-        <w:tblPrEx>
-          <w:tblCellMar>
-            <w:top w:w="0" w:type="dxa"/>
-            <w:bottom w:w="0" w:type="dxa"/>
-          </w:tblCellMar>
-        </w:tblPrEx>
         <w:tc>
           <w:tcPr>
             <w:tcW w:w="2600" w:type="dxa"/>
@@ -25276,12 +23968,6 @@
         </w:tc>
       </w:tr>
       <w:tr>
-        <w:tblPrEx>
-          <w:tblCellMar>
-            <w:top w:w="0" w:type="dxa"/>
-            <w:bottom w:w="0" w:type="dxa"/>
-          </w:tblCellMar>
-        </w:tblPrEx>
         <w:tc>
           <w:tcPr>
             <w:tcW w:w="2600" w:type="dxa"/>
@@ -25340,12 +24026,6 @@
         </w:tc>
       </w:tr>
       <w:tr>
-        <w:tblPrEx>
-          <w:tblCellMar>
-            <w:top w:w="0" w:type="dxa"/>
-            <w:bottom w:w="0" w:type="dxa"/>
-          </w:tblCellMar>
-        </w:tblPrEx>
         <w:tc>
           <w:tcPr>
             <w:tcW w:w="2600" w:type="dxa"/>
@@ -25404,12 +24084,6 @@
         </w:tc>
       </w:tr>
       <w:tr>
-        <w:tblPrEx>
-          <w:tblCellMar>
-            <w:top w:w="0" w:type="dxa"/>
-            <w:bottom w:w="0" w:type="dxa"/>
-          </w:tblCellMar>
-        </w:tblPrEx>
         <w:tc>
           <w:tcPr>
             <w:tcW w:w="2600" w:type="dxa"/>
@@ -25468,12 +24142,6 @@
         </w:tc>
       </w:tr>
       <w:tr>
-        <w:tblPrEx>
-          <w:tblCellMar>
-            <w:top w:w="0" w:type="dxa"/>
-            <w:bottom w:w="0" w:type="dxa"/>
-          </w:tblCellMar>
-        </w:tblPrEx>
         <w:tc>
           <w:tcPr>
             <w:tcW w:w="2600" w:type="dxa"/>
@@ -25570,12 +24238,6 @@
         <w:gridCol w:w="2475"/>
       </w:tblGrid>
       <w:tr>
-        <w:tblPrEx>
-          <w:tblCellMar>
-            <w:top w:w="0" w:type="dxa"/>
-            <w:bottom w:w="0" w:type="dxa"/>
-          </w:tblCellMar>
-        </w:tblPrEx>
         <w:trPr>
           <w:tblHeader/>
         </w:trPr>
@@ -25731,12 +24393,6 @@
         </w:tc>
       </w:tr>
       <w:tr>
-        <w:tblPrEx>
-          <w:tblCellMar>
-            <w:top w:w="0" w:type="dxa"/>
-            <w:bottom w:w="0" w:type="dxa"/>
-          </w:tblCellMar>
-        </w:tblPrEx>
         <w:tc>
           <w:tcPr>
             <w:tcW w:w="2200" w:type="dxa"/>
@@ -25879,12 +24535,6 @@
         </w:tc>
       </w:tr>
       <w:tr>
-        <w:tblPrEx>
-          <w:tblCellMar>
-            <w:top w:w="0" w:type="dxa"/>
-            <w:bottom w:w="0" w:type="dxa"/>
-          </w:tblCellMar>
-        </w:tblPrEx>
         <w:tc>
           <w:tcPr>
             <w:tcW w:w="2200" w:type="dxa"/>
@@ -26027,12 +24677,6 @@
         </w:tc>
       </w:tr>
       <w:tr>
-        <w:tblPrEx>
-          <w:tblCellMar>
-            <w:top w:w="0" w:type="dxa"/>
-            <w:bottom w:w="0" w:type="dxa"/>
-          </w:tblCellMar>
-        </w:tblPrEx>
         <w:tc>
           <w:tcPr>
             <w:tcW w:w="2200" w:type="dxa"/>
@@ -26175,12 +24819,6 @@
         </w:tc>
       </w:tr>
       <w:tr>
-        <w:tblPrEx>
-          <w:tblCellMar>
-            <w:top w:w="0" w:type="dxa"/>
-            <w:bottom w:w="0" w:type="dxa"/>
-          </w:tblCellMar>
-        </w:tblPrEx>
         <w:tc>
           <w:tcPr>
             <w:tcW w:w="2200" w:type="dxa"/>
@@ -26323,12 +24961,6 @@
         </w:tc>
       </w:tr>
       <w:tr>
-        <w:tblPrEx>
-          <w:tblCellMar>
-            <w:top w:w="0" w:type="dxa"/>
-            <w:bottom w:w="0" w:type="dxa"/>
-          </w:tblCellMar>
-        </w:tblPrEx>
         <w:tc>
           <w:tcPr>
             <w:tcW w:w="2200" w:type="dxa"/>
@@ -26471,12 +25103,6 @@
         </w:tc>
       </w:tr>
       <w:tr>
-        <w:tblPrEx>
-          <w:tblCellMar>
-            <w:top w:w="0" w:type="dxa"/>
-            <w:bottom w:w="0" w:type="dxa"/>
-          </w:tblCellMar>
-        </w:tblPrEx>
         <w:tc>
           <w:tcPr>
             <w:tcW w:w="2200" w:type="dxa"/>
@@ -26619,12 +25245,6 @@
         </w:tc>
       </w:tr>
       <w:tr>
-        <w:tblPrEx>
-          <w:tblCellMar>
-            <w:top w:w="0" w:type="dxa"/>
-            <w:bottom w:w="0" w:type="dxa"/>
-          </w:tblCellMar>
-        </w:tblPrEx>
         <w:tc>
           <w:tcPr>
             <w:tcW w:w="2200" w:type="dxa"/>
@@ -26767,12 +25387,6 @@
         </w:tc>
       </w:tr>
       <w:tr>
-        <w:tblPrEx>
-          <w:tblCellMar>
-            <w:top w:w="0" w:type="dxa"/>
-            <w:bottom w:w="0" w:type="dxa"/>
-          </w:tblCellMar>
-        </w:tblPrEx>
         <w:tc>
           <w:tcPr>
             <w:tcW w:w="2200" w:type="dxa"/>
@@ -26915,12 +25529,6 @@
         </w:tc>
       </w:tr>
       <w:tr>
-        <w:tblPrEx>
-          <w:tblCellMar>
-            <w:top w:w="0" w:type="dxa"/>
-            <w:bottom w:w="0" w:type="dxa"/>
-          </w:tblCellMar>
-        </w:tblPrEx>
         <w:tc>
           <w:tcPr>
             <w:tcW w:w="2200" w:type="dxa"/>
@@ -27063,12 +25671,6 @@
         </w:tc>
       </w:tr>
       <w:tr>
-        <w:tblPrEx>
-          <w:tblCellMar>
-            <w:top w:w="0" w:type="dxa"/>
-            <w:bottom w:w="0" w:type="dxa"/>
-          </w:tblCellMar>
-        </w:tblPrEx>
         <w:tc>
           <w:tcPr>
             <w:tcW w:w="2200" w:type="dxa"/>
@@ -27212,12 +25814,6 @@
         </w:tc>
       </w:tr>
       <w:tr>
-        <w:tblPrEx>
-          <w:tblCellMar>
-            <w:top w:w="0" w:type="dxa"/>
-            <w:bottom w:w="0" w:type="dxa"/>
-          </w:tblCellMar>
-        </w:tblPrEx>
         <w:tc>
           <w:tcPr>
             <w:tcW w:w="2200" w:type="dxa"/>
@@ -27360,12 +25956,6 @@
         </w:tc>
       </w:tr>
       <w:tr>
-        <w:tblPrEx>
-          <w:tblCellMar>
-            <w:top w:w="0" w:type="dxa"/>
-            <w:bottom w:w="0" w:type="dxa"/>
-          </w:tblCellMar>
-        </w:tblPrEx>
         <w:tc>
           <w:tcPr>
             <w:tcW w:w="2200" w:type="dxa"/>
@@ -27508,12 +26098,6 @@
         </w:tc>
       </w:tr>
       <w:tr>
-        <w:tblPrEx>
-          <w:tblCellMar>
-            <w:top w:w="0" w:type="dxa"/>
-            <w:bottom w:w="0" w:type="dxa"/>
-          </w:tblCellMar>
-        </w:tblPrEx>
         <w:tc>
           <w:tcPr>
             <w:tcW w:w="2200" w:type="dxa"/>
@@ -27656,12 +26240,6 @@
         </w:tc>
       </w:tr>
       <w:tr>
-        <w:tblPrEx>
-          <w:tblCellMar>
-            <w:top w:w="0" w:type="dxa"/>
-            <w:bottom w:w="0" w:type="dxa"/>
-          </w:tblCellMar>
-        </w:tblPrEx>
         <w:tc>
           <w:tcPr>
             <w:tcW w:w="2200" w:type="dxa"/>
@@ -27804,12 +26382,6 @@
         </w:tc>
       </w:tr>
       <w:tr>
-        <w:tblPrEx>
-          <w:tblCellMar>
-            <w:top w:w="0" w:type="dxa"/>
-            <w:bottom w:w="0" w:type="dxa"/>
-          </w:tblCellMar>
-        </w:tblPrEx>
         <w:tc>
           <w:tcPr>
             <w:tcW w:w="2200" w:type="dxa"/>
@@ -27952,12 +26524,6 @@
         </w:tc>
       </w:tr>
       <w:tr>
-        <w:tblPrEx>
-          <w:tblCellMar>
-            <w:top w:w="0" w:type="dxa"/>
-            <w:bottom w:w="0" w:type="dxa"/>
-          </w:tblCellMar>
-        </w:tblPrEx>
         <w:tc>
           <w:tcPr>
             <w:tcW w:w="2200" w:type="dxa"/>
@@ -28100,12 +26666,6 @@
         </w:tc>
       </w:tr>
       <w:tr>
-        <w:tblPrEx>
-          <w:tblCellMar>
-            <w:top w:w="0" w:type="dxa"/>
-            <w:bottom w:w="0" w:type="dxa"/>
-          </w:tblCellMar>
-        </w:tblPrEx>
         <w:tc>
           <w:tcPr>
             <w:tcW w:w="2200" w:type="dxa"/>
@@ -28248,12 +26808,6 @@
         </w:tc>
       </w:tr>
       <w:tr>
-        <w:tblPrEx>
-          <w:tblCellMar>
-            <w:top w:w="0" w:type="dxa"/>
-            <w:bottom w:w="0" w:type="dxa"/>
-          </w:tblCellMar>
-        </w:tblPrEx>
         <w:tc>
           <w:tcPr>
             <w:tcW w:w="2200" w:type="dxa"/>
@@ -28396,12 +26950,6 @@
         </w:tc>
       </w:tr>
       <w:tr>
-        <w:tblPrEx>
-          <w:tblCellMar>
-            <w:top w:w="0" w:type="dxa"/>
-            <w:bottom w:w="0" w:type="dxa"/>
-          </w:tblCellMar>
-        </w:tblPrEx>
         <w:tc>
           <w:tcPr>
             <w:tcW w:w="2200" w:type="dxa"/>
@@ -28544,12 +27092,6 @@
         </w:tc>
       </w:tr>
       <w:tr>
-        <w:tblPrEx>
-          <w:tblCellMar>
-            <w:top w:w="0" w:type="dxa"/>
-            <w:bottom w:w="0" w:type="dxa"/>
-          </w:tblCellMar>
-        </w:tblPrEx>
         <w:tc>
           <w:tcPr>
             <w:tcW w:w="2200" w:type="dxa"/>
@@ -28692,12 +27234,6 @@
         </w:tc>
       </w:tr>
       <w:tr>
-        <w:tblPrEx>
-          <w:tblCellMar>
-            <w:top w:w="0" w:type="dxa"/>
-            <w:bottom w:w="0" w:type="dxa"/>
-          </w:tblCellMar>
-        </w:tblPrEx>
         <w:tc>
           <w:tcPr>
             <w:tcW w:w="2200" w:type="dxa"/>
@@ -28840,12 +27376,6 @@
         </w:tc>
       </w:tr>
       <w:tr>
-        <w:tblPrEx>
-          <w:tblCellMar>
-            <w:top w:w="0" w:type="dxa"/>
-            <w:bottom w:w="0" w:type="dxa"/>
-          </w:tblCellMar>
-        </w:tblPrEx>
         <w:tc>
           <w:tcPr>
             <w:tcW w:w="2200" w:type="dxa"/>
@@ -28988,12 +27518,6 @@
         </w:tc>
       </w:tr>
       <w:tr>
-        <w:tblPrEx>
-          <w:tblCellMar>
-            <w:top w:w="0" w:type="dxa"/>
-            <w:bottom w:w="0" w:type="dxa"/>
-          </w:tblCellMar>
-        </w:tblPrEx>
         <w:tc>
           <w:tcPr>
             <w:tcW w:w="2200" w:type="dxa"/>
@@ -29136,12 +27660,6 @@
         </w:tc>
       </w:tr>
       <w:tr>
-        <w:tblPrEx>
-          <w:tblCellMar>
-            <w:top w:w="0" w:type="dxa"/>
-            <w:bottom w:w="0" w:type="dxa"/>
-          </w:tblCellMar>
-        </w:tblPrEx>
         <w:tc>
           <w:tcPr>
             <w:tcW w:w="2200" w:type="dxa"/>
@@ -29284,12 +27802,6 @@
         </w:tc>
       </w:tr>
       <w:tr>
-        <w:tblPrEx>
-          <w:tblCellMar>
-            <w:top w:w="0" w:type="dxa"/>
-            <w:bottom w:w="0" w:type="dxa"/>
-          </w:tblCellMar>
-        </w:tblPrEx>
         <w:tc>
           <w:tcPr>
             <w:tcW w:w="2200" w:type="dxa"/>
@@ -29432,12 +27944,6 @@
         </w:tc>
       </w:tr>
       <w:tr>
-        <w:tblPrEx>
-          <w:tblCellMar>
-            <w:top w:w="0" w:type="dxa"/>
-            <w:bottom w:w="0" w:type="dxa"/>
-          </w:tblCellMar>
-        </w:tblPrEx>
         <w:tc>
           <w:tcPr>
             <w:tcW w:w="2200" w:type="dxa"/>
@@ -29580,12 +28086,6 @@
         </w:tc>
       </w:tr>
       <w:tr>
-        <w:tblPrEx>
-          <w:tblCellMar>
-            <w:top w:w="0" w:type="dxa"/>
-            <w:bottom w:w="0" w:type="dxa"/>
-          </w:tblCellMar>
-        </w:tblPrEx>
         <w:tc>
           <w:tcPr>
             <w:tcW w:w="2200" w:type="dxa"/>
@@ -29728,12 +28228,6 @@
         </w:tc>
       </w:tr>
       <w:tr>
-        <w:tblPrEx>
-          <w:tblCellMar>
-            <w:top w:w="0" w:type="dxa"/>
-            <w:bottom w:w="0" w:type="dxa"/>
-          </w:tblCellMar>
-        </w:tblPrEx>
         <w:tc>
           <w:tcPr>
             <w:tcW w:w="2200" w:type="dxa"/>
@@ -29876,12 +28370,6 @@
         </w:tc>
       </w:tr>
       <w:tr>
-        <w:tblPrEx>
-          <w:tblCellMar>
-            <w:top w:w="0" w:type="dxa"/>
-            <w:bottom w:w="0" w:type="dxa"/>
-          </w:tblCellMar>
-        </w:tblPrEx>
         <w:tc>
           <w:tcPr>
             <w:tcW w:w="2200" w:type="dxa"/>
@@ -30024,12 +28512,6 @@
         </w:tc>
       </w:tr>
       <w:tr>
-        <w:tblPrEx>
-          <w:tblCellMar>
-            <w:top w:w="0" w:type="dxa"/>
-            <w:bottom w:w="0" w:type="dxa"/>
-          </w:tblCellMar>
-        </w:tblPrEx>
         <w:tc>
           <w:tcPr>
             <w:tcW w:w="2200" w:type="dxa"/>
@@ -30172,12 +28654,6 @@
         </w:tc>
       </w:tr>
       <w:tr>
-        <w:tblPrEx>
-          <w:tblCellMar>
-            <w:top w:w="0" w:type="dxa"/>
-            <w:bottom w:w="0" w:type="dxa"/>
-          </w:tblCellMar>
-        </w:tblPrEx>
         <w:tc>
           <w:tcPr>
             <w:tcW w:w="2200" w:type="dxa"/>
@@ -30320,12 +28796,6 @@
         </w:tc>
       </w:tr>
       <w:tr>
-        <w:tblPrEx>
-          <w:tblCellMar>
-            <w:top w:w="0" w:type="dxa"/>
-            <w:bottom w:w="0" w:type="dxa"/>
-          </w:tblCellMar>
-        </w:tblPrEx>
         <w:tc>
           <w:tcPr>
             <w:tcW w:w="2200" w:type="dxa"/>
@@ -30468,12 +28938,6 @@
         </w:tc>
       </w:tr>
       <w:tr>
-        <w:tblPrEx>
-          <w:tblCellMar>
-            <w:top w:w="0" w:type="dxa"/>
-            <w:bottom w:w="0" w:type="dxa"/>
-          </w:tblCellMar>
-        </w:tblPrEx>
         <w:tc>
           <w:tcPr>
             <w:tcW w:w="2200" w:type="dxa"/>
@@ -30617,12 +29081,6 @@
         </w:tc>
       </w:tr>
       <w:tr>
-        <w:tblPrEx>
-          <w:tblCellMar>
-            <w:top w:w="0" w:type="dxa"/>
-            <w:bottom w:w="0" w:type="dxa"/>
-          </w:tblCellMar>
-        </w:tblPrEx>
         <w:tc>
           <w:tcPr>
             <w:tcW w:w="2200" w:type="dxa"/>
@@ -30765,12 +29223,6 @@
         </w:tc>
       </w:tr>
       <w:tr>
-        <w:tblPrEx>
-          <w:tblCellMar>
-            <w:top w:w="0" w:type="dxa"/>
-            <w:bottom w:w="0" w:type="dxa"/>
-          </w:tblCellMar>
-        </w:tblPrEx>
         <w:tc>
           <w:tcPr>
             <w:tcW w:w="2200" w:type="dxa"/>
@@ -30913,12 +29365,6 @@
         </w:tc>
       </w:tr>
       <w:tr>
-        <w:tblPrEx>
-          <w:tblCellMar>
-            <w:top w:w="0" w:type="dxa"/>
-            <w:bottom w:w="0" w:type="dxa"/>
-          </w:tblCellMar>
-        </w:tblPrEx>
         <w:tc>
           <w:tcPr>
             <w:tcW w:w="2200" w:type="dxa"/>
@@ -31061,12 +29507,6 @@
         </w:tc>
       </w:tr>
       <w:tr>
-        <w:tblPrEx>
-          <w:tblCellMar>
-            <w:top w:w="0" w:type="dxa"/>
-            <w:bottom w:w="0" w:type="dxa"/>
-          </w:tblCellMar>
-        </w:tblPrEx>
         <w:tc>
           <w:tcPr>
             <w:tcW w:w="2200" w:type="dxa"/>
@@ -31209,12 +29649,6 @@
         </w:tc>
       </w:tr>
       <w:tr>
-        <w:tblPrEx>
-          <w:tblCellMar>
-            <w:top w:w="0" w:type="dxa"/>
-            <w:bottom w:w="0" w:type="dxa"/>
-          </w:tblCellMar>
-        </w:tblPrEx>
         <w:tc>
           <w:tcPr>
             <w:tcW w:w="2200" w:type="dxa"/>
@@ -31357,12 +29791,6 @@
         </w:tc>
       </w:tr>
       <w:tr>
-        <w:tblPrEx>
-          <w:tblCellMar>
-            <w:top w:w="0" w:type="dxa"/>
-            <w:bottom w:w="0" w:type="dxa"/>
-          </w:tblCellMar>
-        </w:tblPrEx>
         <w:tc>
           <w:tcPr>
             <w:tcW w:w="2200" w:type="dxa"/>
@@ -31505,12 +29933,6 @@
         </w:tc>
       </w:tr>
       <w:tr>
-        <w:tblPrEx>
-          <w:tblCellMar>
-            <w:top w:w="0" w:type="dxa"/>
-            <w:bottom w:w="0" w:type="dxa"/>
-          </w:tblCellMar>
-        </w:tblPrEx>
         <w:tc>
           <w:tcPr>
             <w:tcW w:w="2200" w:type="dxa"/>
@@ -31653,12 +30075,6 @@
         </w:tc>
       </w:tr>
       <w:tr>
-        <w:tblPrEx>
-          <w:tblCellMar>
-            <w:top w:w="0" w:type="dxa"/>
-            <w:bottom w:w="0" w:type="dxa"/>
-          </w:tblCellMar>
-        </w:tblPrEx>
         <w:tc>
           <w:tcPr>
             <w:tcW w:w="2200" w:type="dxa"/>
@@ -31801,12 +30217,6 @@
         </w:tc>
       </w:tr>
       <w:tr>
-        <w:tblPrEx>
-          <w:tblCellMar>
-            <w:top w:w="0" w:type="dxa"/>
-            <w:bottom w:w="0" w:type="dxa"/>
-          </w:tblCellMar>
-        </w:tblPrEx>
         <w:tc>
           <w:tcPr>
             <w:tcW w:w="2200" w:type="dxa"/>
@@ -31949,12 +30359,6 @@
         </w:tc>
       </w:tr>
       <w:tr>
-        <w:tblPrEx>
-          <w:tblCellMar>
-            <w:top w:w="0" w:type="dxa"/>
-            <w:bottom w:w="0" w:type="dxa"/>
-          </w:tblCellMar>
-        </w:tblPrEx>
         <w:tc>
           <w:tcPr>
             <w:tcW w:w="2200" w:type="dxa"/>
@@ -32097,12 +30501,6 @@
         </w:tc>
       </w:tr>
       <w:tr>
-        <w:tblPrEx>
-          <w:tblCellMar>
-            <w:top w:w="0" w:type="dxa"/>
-            <w:bottom w:w="0" w:type="dxa"/>
-          </w:tblCellMar>
-        </w:tblPrEx>
         <w:tc>
           <w:tcPr>
             <w:tcW w:w="2200" w:type="dxa"/>
@@ -32245,12 +30643,6 @@
         </w:tc>
       </w:tr>
       <w:tr>
-        <w:tblPrEx>
-          <w:tblCellMar>
-            <w:top w:w="0" w:type="dxa"/>
-            <w:bottom w:w="0" w:type="dxa"/>
-          </w:tblCellMar>
-        </w:tblPrEx>
         <w:tc>
           <w:tcPr>
             <w:tcW w:w="2200" w:type="dxa"/>
@@ -32437,12 +30829,6 @@
         <w:gridCol w:w="6426"/>
       </w:tblGrid>
       <w:tr>
-        <w:tblPrEx>
-          <w:tblCellMar>
-            <w:top w:w="0" w:type="dxa"/>
-            <w:bottom w:w="0" w:type="dxa"/>
-          </w:tblCellMar>
-        </w:tblPrEx>
         <w:trPr>
           <w:tblHeader/>
         </w:trPr>
@@ -32508,12 +30894,6 @@
         </w:tc>
       </w:tr>
       <w:tr>
-        <w:tblPrEx>
-          <w:tblCellMar>
-            <w:top w:w="0" w:type="dxa"/>
-            <w:bottom w:w="0" w:type="dxa"/>
-          </w:tblCellMar>
-        </w:tblPrEx>
         <w:tc>
           <w:tcPr>
             <w:tcW w:w="2600" w:type="dxa"/>
@@ -32572,12 +30952,6 @@
         </w:tc>
       </w:tr>
       <w:tr>
-        <w:tblPrEx>
-          <w:tblCellMar>
-            <w:top w:w="0" w:type="dxa"/>
-            <w:bottom w:w="0" w:type="dxa"/>
-          </w:tblCellMar>
-        </w:tblPrEx>
         <w:tc>
           <w:tcPr>
             <w:tcW w:w="2600" w:type="dxa"/>
@@ -32636,12 +31010,6 @@
         </w:tc>
       </w:tr>
       <w:tr>
-        <w:tblPrEx>
-          <w:tblCellMar>
-            <w:top w:w="0" w:type="dxa"/>
-            <w:bottom w:w="0" w:type="dxa"/>
-          </w:tblCellMar>
-        </w:tblPrEx>
         <w:tc>
           <w:tcPr>
             <w:tcW w:w="2600" w:type="dxa"/>
@@ -32700,12 +31068,6 @@
         </w:tc>
       </w:tr>
       <w:tr>
-        <w:tblPrEx>
-          <w:tblCellMar>
-            <w:top w:w="0" w:type="dxa"/>
-            <w:bottom w:w="0" w:type="dxa"/>
-          </w:tblCellMar>
-        </w:tblPrEx>
         <w:tc>
           <w:tcPr>
             <w:tcW w:w="2600" w:type="dxa"/>
@@ -32764,12 +31126,6 @@
         </w:tc>
       </w:tr>
       <w:tr>
-        <w:tblPrEx>
-          <w:tblCellMar>
-            <w:top w:w="0" w:type="dxa"/>
-            <w:bottom w:w="0" w:type="dxa"/>
-          </w:tblCellMar>
-        </w:tblPrEx>
         <w:tc>
           <w:tcPr>
             <w:tcW w:w="2600" w:type="dxa"/>
@@ -32828,12 +31184,6 @@
         </w:tc>
       </w:tr>
       <w:tr>
-        <w:tblPrEx>
-          <w:tblCellMar>
-            <w:top w:w="0" w:type="dxa"/>
-            <w:bottom w:w="0" w:type="dxa"/>
-          </w:tblCellMar>
-        </w:tblPrEx>
         <w:tc>
           <w:tcPr>
             <w:tcW w:w="2600" w:type="dxa"/>
@@ -32892,12 +31242,6 @@
         </w:tc>
       </w:tr>
       <w:tr>
-        <w:tblPrEx>
-          <w:tblCellMar>
-            <w:top w:w="0" w:type="dxa"/>
-            <w:bottom w:w="0" w:type="dxa"/>
-          </w:tblCellMar>
-        </w:tblPrEx>
         <w:tc>
           <w:tcPr>
             <w:tcW w:w="2600" w:type="dxa"/>
@@ -32956,12 +31300,6 @@
         </w:tc>
       </w:tr>
       <w:tr>
-        <w:tblPrEx>
-          <w:tblCellMar>
-            <w:top w:w="0" w:type="dxa"/>
-            <w:bottom w:w="0" w:type="dxa"/>
-          </w:tblCellMar>
-        </w:tblPrEx>
         <w:tc>
           <w:tcPr>
             <w:tcW w:w="2600" w:type="dxa"/>
@@ -33020,12 +31358,6 @@
         </w:tc>
       </w:tr>
       <w:tr>
-        <w:tblPrEx>
-          <w:tblCellMar>
-            <w:top w:w="0" w:type="dxa"/>
-            <w:bottom w:w="0" w:type="dxa"/>
-          </w:tblCellMar>
-        </w:tblPrEx>
         <w:tc>
           <w:tcPr>
             <w:tcW w:w="2600" w:type="dxa"/>
@@ -33084,12 +31416,6 @@
         </w:tc>
       </w:tr>
       <w:tr>
-        <w:tblPrEx>
-          <w:tblCellMar>
-            <w:top w:w="0" w:type="dxa"/>
-            <w:bottom w:w="0" w:type="dxa"/>
-          </w:tblCellMar>
-        </w:tblPrEx>
         <w:tc>
           <w:tcPr>
             <w:tcW w:w="2600" w:type="dxa"/>
@@ -33148,12 +31474,6 @@
         </w:tc>
       </w:tr>
       <w:tr>
-        <w:tblPrEx>
-          <w:tblCellMar>
-            <w:top w:w="0" w:type="dxa"/>
-            <w:bottom w:w="0" w:type="dxa"/>
-          </w:tblCellMar>
-        </w:tblPrEx>
         <w:tc>
           <w:tcPr>
             <w:tcW w:w="2600" w:type="dxa"/>
@@ -33212,12 +31532,6 @@
         </w:tc>
       </w:tr>
       <w:tr>
-        <w:tblPrEx>
-          <w:tblCellMar>
-            <w:top w:w="0" w:type="dxa"/>
-            <w:bottom w:w="0" w:type="dxa"/>
-          </w:tblCellMar>
-        </w:tblPrEx>
         <w:tc>
           <w:tcPr>
             <w:tcW w:w="2600" w:type="dxa"/>
@@ -33276,12 +31590,6 @@
         </w:tc>
       </w:tr>
       <w:tr>
-        <w:tblPrEx>
-          <w:tblCellMar>
-            <w:top w:w="0" w:type="dxa"/>
-            <w:bottom w:w="0" w:type="dxa"/>
-          </w:tblCellMar>
-        </w:tblPrEx>
         <w:tc>
           <w:tcPr>
             <w:tcW w:w="2600" w:type="dxa"/>
@@ -33340,12 +31648,6 @@
         </w:tc>
       </w:tr>
       <w:tr>
-        <w:tblPrEx>
-          <w:tblCellMar>
-            <w:top w:w="0" w:type="dxa"/>
-            <w:bottom w:w="0" w:type="dxa"/>
-          </w:tblCellMar>
-        </w:tblPrEx>
         <w:tc>
           <w:tcPr>
             <w:tcW w:w="2600" w:type="dxa"/>
@@ -33404,12 +31706,6 @@
         </w:tc>
       </w:tr>
       <w:tr>
-        <w:tblPrEx>
-          <w:tblCellMar>
-            <w:top w:w="0" w:type="dxa"/>
-            <w:bottom w:w="0" w:type="dxa"/>
-          </w:tblCellMar>
-        </w:tblPrEx>
         <w:tc>
           <w:tcPr>
             <w:tcW w:w="2600" w:type="dxa"/>
@@ -33468,12 +31764,6 @@
         </w:tc>
       </w:tr>
       <w:tr>
-        <w:tblPrEx>
-          <w:tblCellMar>
-            <w:top w:w="0" w:type="dxa"/>
-            <w:bottom w:w="0" w:type="dxa"/>
-          </w:tblCellMar>
-        </w:tblPrEx>
         <w:tc>
           <w:tcPr>
             <w:tcW w:w="2600" w:type="dxa"/>
@@ -33532,12 +31822,6 @@
         </w:tc>
       </w:tr>
       <w:tr>
-        <w:tblPrEx>
-          <w:tblCellMar>
-            <w:top w:w="0" w:type="dxa"/>
-            <w:bottom w:w="0" w:type="dxa"/>
-          </w:tblCellMar>
-        </w:tblPrEx>
         <w:tc>
           <w:tcPr>
             <w:tcW w:w="2600" w:type="dxa"/>
@@ -33596,12 +31880,6 @@
         </w:tc>
       </w:tr>
       <w:tr>
-        <w:tblPrEx>
-          <w:tblCellMar>
-            <w:top w:w="0" w:type="dxa"/>
-            <w:bottom w:w="0" w:type="dxa"/>
-          </w:tblCellMar>
-        </w:tblPrEx>
         <w:tc>
           <w:tcPr>
             <w:tcW w:w="2600" w:type="dxa"/>
@@ -33697,12 +31975,6 @@
         <w:gridCol w:w="2326"/>
       </w:tblGrid>
       <w:tr>
-        <w:tblPrEx>
-          <w:tblCellMar>
-            <w:top w:w="0" w:type="dxa"/>
-            <w:bottom w:w="0" w:type="dxa"/>
-          </w:tblCellMar>
-        </w:tblPrEx>
         <w:trPr>
           <w:tblHeader/>
         </w:trPr>
@@ -33829,12 +32101,6 @@
         </w:tc>
       </w:tr>
       <w:tr>
-        <w:tblPrEx>
-          <w:tblCellMar>
-            <w:top w:w="0" w:type="dxa"/>
-            <w:bottom w:w="0" w:type="dxa"/>
-          </w:tblCellMar>
-        </w:tblPrEx>
         <w:tc>
           <w:tcPr>
             <w:tcW w:w="3000" w:type="dxa"/>
@@ -33949,12 +32215,6 @@
         </w:tc>
       </w:tr>
       <w:tr>
-        <w:tblPrEx>
-          <w:tblCellMar>
-            <w:top w:w="0" w:type="dxa"/>
-            <w:bottom w:w="0" w:type="dxa"/>
-          </w:tblCellMar>
-        </w:tblPrEx>
         <w:tc>
           <w:tcPr>
             <w:tcW w:w="3000" w:type="dxa"/>
@@ -34069,12 +32329,6 @@
         </w:tc>
       </w:tr>
       <w:tr>
-        <w:tblPrEx>
-          <w:tblCellMar>
-            <w:top w:w="0" w:type="dxa"/>
-            <w:bottom w:w="0" w:type="dxa"/>
-          </w:tblCellMar>
-        </w:tblPrEx>
         <w:tc>
           <w:tcPr>
             <w:tcW w:w="3000" w:type="dxa"/>
@@ -34189,12 +32443,6 @@
         </w:tc>
       </w:tr>
       <w:tr>
-        <w:tblPrEx>
-          <w:tblCellMar>
-            <w:top w:w="0" w:type="dxa"/>
-            <w:bottom w:w="0" w:type="dxa"/>
-          </w:tblCellMar>
-        </w:tblPrEx>
         <w:tc>
           <w:tcPr>
             <w:tcW w:w="3000" w:type="dxa"/>
@@ -34309,12 +32557,6 @@
         </w:tc>
       </w:tr>
       <w:tr>
-        <w:tblPrEx>
-          <w:tblCellMar>
-            <w:top w:w="0" w:type="dxa"/>
-            <w:bottom w:w="0" w:type="dxa"/>
-          </w:tblCellMar>
-        </w:tblPrEx>
         <w:tc>
           <w:tcPr>
             <w:tcW w:w="3000" w:type="dxa"/>
@@ -34429,12 +32671,6 @@
         </w:tc>
       </w:tr>
       <w:tr>
-        <w:tblPrEx>
-          <w:tblCellMar>
-            <w:top w:w="0" w:type="dxa"/>
-            <w:bottom w:w="0" w:type="dxa"/>
-          </w:tblCellMar>
-        </w:tblPrEx>
         <w:tc>
           <w:tcPr>
             <w:tcW w:w="3000" w:type="dxa"/>
@@ -34549,12 +32785,6 @@
         </w:tc>
       </w:tr>
       <w:tr>
-        <w:tblPrEx>
-          <w:tblCellMar>
-            <w:top w:w="0" w:type="dxa"/>
-            <w:bottom w:w="0" w:type="dxa"/>
-          </w:tblCellMar>
-        </w:tblPrEx>
         <w:tc>
           <w:tcPr>
             <w:tcW w:w="3000" w:type="dxa"/>
@@ -34669,12 +32899,6 @@
         </w:tc>
       </w:tr>
       <w:tr>
-        <w:tblPrEx>
-          <w:tblCellMar>
-            <w:top w:w="0" w:type="dxa"/>
-            <w:bottom w:w="0" w:type="dxa"/>
-          </w:tblCellMar>
-        </w:tblPrEx>
         <w:tc>
           <w:tcPr>
             <w:tcW w:w="3000" w:type="dxa"/>
@@ -34789,12 +33013,6 @@
         </w:tc>
       </w:tr>
       <w:tr>
-        <w:tblPrEx>
-          <w:tblCellMar>
-            <w:top w:w="0" w:type="dxa"/>
-            <w:bottom w:w="0" w:type="dxa"/>
-          </w:tblCellMar>
-        </w:tblPrEx>
         <w:tc>
           <w:tcPr>
             <w:tcW w:w="3000" w:type="dxa"/>
@@ -34909,12 +33127,6 @@
         </w:tc>
       </w:tr>
       <w:tr>
-        <w:tblPrEx>
-          <w:tblCellMar>
-            <w:top w:w="0" w:type="dxa"/>
-            <w:bottom w:w="0" w:type="dxa"/>
-          </w:tblCellMar>
-        </w:tblPrEx>
         <w:tc>
           <w:tcPr>
             <w:tcW w:w="3000" w:type="dxa"/>
@@ -35029,12 +33241,6 @@
         </w:tc>
       </w:tr>
       <w:tr>
-        <w:tblPrEx>
-          <w:tblCellMar>
-            <w:top w:w="0" w:type="dxa"/>
-            <w:bottom w:w="0" w:type="dxa"/>
-          </w:tblCellMar>
-        </w:tblPrEx>
         <w:tc>
           <w:tcPr>
             <w:tcW w:w="3000" w:type="dxa"/>
@@ -35149,12 +33355,6 @@
         </w:tc>
       </w:tr>
       <w:tr>
-        <w:tblPrEx>
-          <w:tblCellMar>
-            <w:top w:w="0" w:type="dxa"/>
-            <w:bottom w:w="0" w:type="dxa"/>
-          </w:tblCellMar>
-        </w:tblPrEx>
         <w:tc>
           <w:tcPr>
             <w:tcW w:w="3000" w:type="dxa"/>
@@ -35269,12 +33469,6 @@
         </w:tc>
       </w:tr>
       <w:tr>
-        <w:tblPrEx>
-          <w:tblCellMar>
-            <w:top w:w="0" w:type="dxa"/>
-            <w:bottom w:w="0" w:type="dxa"/>
-          </w:tblCellMar>
-        </w:tblPrEx>
         <w:tc>
           <w:tcPr>
             <w:tcW w:w="3000" w:type="dxa"/>
@@ -35389,12 +33583,6 @@
         </w:tc>
       </w:tr>
       <w:tr>
-        <w:tblPrEx>
-          <w:tblCellMar>
-            <w:top w:w="0" w:type="dxa"/>
-            <w:bottom w:w="0" w:type="dxa"/>
-          </w:tblCellMar>
-        </w:tblPrEx>
         <w:tc>
           <w:tcPr>
             <w:tcW w:w="3000" w:type="dxa"/>
@@ -35509,12 +33697,6 @@
         </w:tc>
       </w:tr>
       <w:tr>
-        <w:tblPrEx>
-          <w:tblCellMar>
-            <w:top w:w="0" w:type="dxa"/>
-            <w:bottom w:w="0" w:type="dxa"/>
-          </w:tblCellMar>
-        </w:tblPrEx>
         <w:tc>
           <w:tcPr>
             <w:tcW w:w="3000" w:type="dxa"/>
@@ -35629,12 +33811,6 @@
         </w:tc>
       </w:tr>
       <w:tr>
-        <w:tblPrEx>
-          <w:tblCellMar>
-            <w:top w:w="0" w:type="dxa"/>
-            <w:bottom w:w="0" w:type="dxa"/>
-          </w:tblCellMar>
-        </w:tblPrEx>
         <w:tc>
           <w:tcPr>
             <w:tcW w:w="3000" w:type="dxa"/>
@@ -35749,12 +33925,6 @@
         </w:tc>
       </w:tr>
       <w:tr>
-        <w:tblPrEx>
-          <w:tblCellMar>
-            <w:top w:w="0" w:type="dxa"/>
-            <w:bottom w:w="0" w:type="dxa"/>
-          </w:tblCellMar>
-        </w:tblPrEx>
         <w:tc>
           <w:tcPr>
             <w:tcW w:w="3000" w:type="dxa"/>
@@ -35869,12 +34039,6 @@
         </w:tc>
       </w:tr>
       <w:tr>
-        <w:tblPrEx>
-          <w:tblCellMar>
-            <w:top w:w="0" w:type="dxa"/>
-            <w:bottom w:w="0" w:type="dxa"/>
-          </w:tblCellMar>
-        </w:tblPrEx>
         <w:tc>
           <w:tcPr>
             <w:tcW w:w="3000" w:type="dxa"/>
@@ -36035,12 +34199,6 @@
         <w:gridCol w:w="4834"/>
       </w:tblGrid>
       <w:tr>
-        <w:tblPrEx>
-          <w:tblCellMar>
-            <w:top w:w="0" w:type="dxa"/>
-            <w:bottom w:w="0" w:type="dxa"/>
-          </w:tblCellMar>
-        </w:tblPrEx>
         <w:trPr>
           <w:tblHeader/>
         </w:trPr>
@@ -36166,12 +34324,6 @@
         </w:tc>
       </w:tr>
       <w:tr>
-        <w:tblPrEx>
-          <w:tblCellMar>
-            <w:top w:w="0" w:type="dxa"/>
-            <w:bottom w:w="0" w:type="dxa"/>
-          </w:tblCellMar>
-        </w:tblPrEx>
         <w:tc>
           <w:tcPr>
             <w:tcW w:w="900" w:type="dxa"/>
@@ -36286,12 +34438,6 @@
         </w:tc>
       </w:tr>
       <w:tr>
-        <w:tblPrEx>
-          <w:tblCellMar>
-            <w:top w:w="0" w:type="dxa"/>
-            <w:bottom w:w="0" w:type="dxa"/>
-          </w:tblCellMar>
-        </w:tblPrEx>
         <w:tc>
           <w:tcPr>
             <w:tcW w:w="900" w:type="dxa"/>
@@ -36406,12 +34552,6 @@
         </w:tc>
       </w:tr>
       <w:tr>
-        <w:tblPrEx>
-          <w:tblCellMar>
-            <w:top w:w="0" w:type="dxa"/>
-            <w:bottom w:w="0" w:type="dxa"/>
-          </w:tblCellMar>
-        </w:tblPrEx>
         <w:tc>
           <w:tcPr>
             <w:tcW w:w="900" w:type="dxa"/>
@@ -36526,12 +34666,6 @@
         </w:tc>
       </w:tr>
       <w:tr>
-        <w:tblPrEx>
-          <w:tblCellMar>
-            <w:top w:w="0" w:type="dxa"/>
-            <w:bottom w:w="0" w:type="dxa"/>
-          </w:tblCellMar>
-        </w:tblPrEx>
         <w:tc>
           <w:tcPr>
             <w:tcW w:w="900" w:type="dxa"/>
@@ -36646,12 +34780,6 @@
         </w:tc>
       </w:tr>
       <w:tr>
-        <w:tblPrEx>
-          <w:tblCellMar>
-            <w:top w:w="0" w:type="dxa"/>
-            <w:bottom w:w="0" w:type="dxa"/>
-          </w:tblCellMar>
-        </w:tblPrEx>
         <w:tc>
           <w:tcPr>
             <w:tcW w:w="900" w:type="dxa"/>
@@ -36766,12 +34894,6 @@
         </w:tc>
       </w:tr>
       <w:tr>
-        <w:tblPrEx>
-          <w:tblCellMar>
-            <w:top w:w="0" w:type="dxa"/>
-            <w:bottom w:w="0" w:type="dxa"/>
-          </w:tblCellMar>
-        </w:tblPrEx>
         <w:tc>
           <w:tcPr>
             <w:tcW w:w="900" w:type="dxa"/>
@@ -36886,12 +35008,6 @@
         </w:tc>
       </w:tr>
       <w:tr>
-        <w:tblPrEx>
-          <w:tblCellMar>
-            <w:top w:w="0" w:type="dxa"/>
-            <w:bottom w:w="0" w:type="dxa"/>
-          </w:tblCellMar>
-        </w:tblPrEx>
         <w:tc>
           <w:tcPr>
             <w:tcW w:w="900" w:type="dxa"/>
@@ -37006,12 +35122,6 @@
         </w:tc>
       </w:tr>
       <w:tr>
-        <w:tblPrEx>
-          <w:tblCellMar>
-            <w:top w:w="0" w:type="dxa"/>
-            <w:bottom w:w="0" w:type="dxa"/>
-          </w:tblCellMar>
-        </w:tblPrEx>
         <w:tc>
           <w:tcPr>
             <w:tcW w:w="900" w:type="dxa"/>
@@ -37126,12 +35236,6 @@
         </w:tc>
       </w:tr>
       <w:tr>
-        <w:tblPrEx>
-          <w:tblCellMar>
-            <w:top w:w="0" w:type="dxa"/>
-            <w:bottom w:w="0" w:type="dxa"/>
-          </w:tblCellMar>
-        </w:tblPrEx>
         <w:tc>
           <w:tcPr>
             <w:tcW w:w="900" w:type="dxa"/>
@@ -37246,12 +35350,6 @@
         </w:tc>
       </w:tr>
       <w:tr>
-        <w:tblPrEx>
-          <w:tblCellMar>
-            <w:top w:w="0" w:type="dxa"/>
-            <w:bottom w:w="0" w:type="dxa"/>
-          </w:tblCellMar>
-        </w:tblPrEx>
         <w:tc>
           <w:tcPr>
             <w:tcW w:w="900" w:type="dxa"/>
@@ -37366,12 +35464,6 @@
         </w:tc>
       </w:tr>
       <w:tr>
-        <w:tblPrEx>
-          <w:tblCellMar>
-            <w:top w:w="0" w:type="dxa"/>
-            <w:bottom w:w="0" w:type="dxa"/>
-          </w:tblCellMar>
-        </w:tblPrEx>
         <w:tc>
           <w:tcPr>
             <w:tcW w:w="900" w:type="dxa"/>
@@ -37486,12 +35578,6 @@
         </w:tc>
       </w:tr>
       <w:tr>
-        <w:tblPrEx>
-          <w:tblCellMar>
-            <w:top w:w="0" w:type="dxa"/>
-            <w:bottom w:w="0" w:type="dxa"/>
-          </w:tblCellMar>
-        </w:tblPrEx>
         <w:tc>
           <w:tcPr>
             <w:tcW w:w="900" w:type="dxa"/>
@@ -37606,12 +35692,6 @@
         </w:tc>
       </w:tr>
       <w:tr>
-        <w:tblPrEx>
-          <w:tblCellMar>
-            <w:top w:w="0" w:type="dxa"/>
-            <w:bottom w:w="0" w:type="dxa"/>
-          </w:tblCellMar>
-        </w:tblPrEx>
         <w:tc>
           <w:tcPr>
             <w:tcW w:w="900" w:type="dxa"/>
@@ -37726,12 +35806,6 @@
         </w:tc>
       </w:tr>
       <w:tr>
-        <w:tblPrEx>
-          <w:tblCellMar>
-            <w:top w:w="0" w:type="dxa"/>
-            <w:bottom w:w="0" w:type="dxa"/>
-          </w:tblCellMar>
-        </w:tblPrEx>
         <w:tc>
           <w:tcPr>
             <w:tcW w:w="900" w:type="dxa"/>
@@ -37846,12 +35920,6 @@
         </w:tc>
       </w:tr>
       <w:tr>
-        <w:tblPrEx>
-          <w:tblCellMar>
-            <w:top w:w="0" w:type="dxa"/>
-            <w:bottom w:w="0" w:type="dxa"/>
-          </w:tblCellMar>
-        </w:tblPrEx>
         <w:tc>
           <w:tcPr>
             <w:tcW w:w="900" w:type="dxa"/>
@@ -37975,12 +36043,6 @@
         </w:tc>
       </w:tr>
       <w:tr>
-        <w:tblPrEx>
-          <w:tblCellMar>
-            <w:top w:w="0" w:type="dxa"/>
-            <w:bottom w:w="0" w:type="dxa"/>
-          </w:tblCellMar>
-        </w:tblPrEx>
         <w:tc>
           <w:tcPr>
             <w:tcW w:w="900" w:type="dxa"/>
@@ -38005,6 +36067,7 @@
                 <w:sz w:val="20"/>
                 <w:szCs w:val="20"/>
               </w:rPr>
+              <w:lastRenderedPageBreak/>
               <w:t>V0.16</w:t>
             </w:r>
           </w:p>
@@ -38095,12 +36158,6 @@
         </w:tc>
       </w:tr>
       <w:tr>
-        <w:tblPrEx>
-          <w:tblCellMar>
-            <w:top w:w="0" w:type="dxa"/>
-            <w:bottom w:w="0" w:type="dxa"/>
-          </w:tblCellMar>
-        </w:tblPrEx>
         <w:tc>
           <w:tcPr>
             <w:tcW w:w="900" w:type="dxa"/>
@@ -38215,12 +36272,6 @@
         </w:tc>
       </w:tr>
       <w:tr>
-        <w:tblPrEx>
-          <w:tblCellMar>
-            <w:top w:w="0" w:type="dxa"/>
-            <w:bottom w:w="0" w:type="dxa"/>
-          </w:tblCellMar>
-        </w:tblPrEx>
         <w:tc>
           <w:tcPr>
             <w:tcW w:w="900" w:type="dxa"/>
@@ -38335,12 +36386,6 @@
         </w:tc>
       </w:tr>
       <w:tr>
-        <w:tblPrEx>
-          <w:tblCellMar>
-            <w:top w:w="0" w:type="dxa"/>
-            <w:bottom w:w="0" w:type="dxa"/>
-          </w:tblCellMar>
-        </w:tblPrEx>
         <w:tc>
           <w:tcPr>
             <w:tcW w:w="900" w:type="dxa"/>
@@ -38455,12 +36500,6 @@
         </w:tc>
       </w:tr>
       <w:tr>
-        <w:tblPrEx>
-          <w:tblCellMar>
-            <w:top w:w="0" w:type="dxa"/>
-            <w:bottom w:w="0" w:type="dxa"/>
-          </w:tblCellMar>
-        </w:tblPrEx>
         <w:tc>
           <w:tcPr>
             <w:tcW w:w="900" w:type="dxa"/>
@@ -38575,12 +36614,6 @@
         </w:tc>
       </w:tr>
       <w:tr>
-        <w:tblPrEx>
-          <w:tblCellMar>
-            <w:top w:w="0" w:type="dxa"/>
-            <w:bottom w:w="0" w:type="dxa"/>
-          </w:tblCellMar>
-        </w:tblPrEx>
         <w:tc>
           <w:tcPr>
             <w:tcW w:w="900" w:type="dxa"/>
@@ -38695,12 +36728,6 @@
         </w:tc>
       </w:tr>
       <w:tr>
-        <w:tblPrEx>
-          <w:tblCellMar>
-            <w:top w:w="0" w:type="dxa"/>
-            <w:bottom w:w="0" w:type="dxa"/>
-          </w:tblCellMar>
-        </w:tblPrEx>
         <w:tc>
           <w:tcPr>
             <w:tcW w:w="900" w:type="dxa"/>
@@ -38929,12 +36956,6 @@
         <w:gridCol w:w="1700"/>
       </w:tblGrid>
       <w:tr>
-        <w:tblPrEx>
-          <w:tblCellMar>
-            <w:top w:w="0" w:type="dxa"/>
-            <w:bottom w:w="0" w:type="dxa"/>
-          </w:tblCellMar>
-        </w:tblPrEx>
         <w:trPr>
           <w:tblHeader/>
         </w:trPr>
@@ -39030,12 +37051,6 @@
         </w:tc>
       </w:tr>
       <w:tr>
-        <w:tblPrEx>
-          <w:tblCellMar>
-            <w:top w:w="0" w:type="dxa"/>
-            <w:bottom w:w="0" w:type="dxa"/>
-          </w:tblCellMar>
-        </w:tblPrEx>
         <w:tc>
           <w:tcPr>
             <w:tcW w:w="3200" w:type="dxa"/>
@@ -39122,12 +37137,6 @@
         </w:tc>
       </w:tr>
       <w:tr>
-        <w:tblPrEx>
-          <w:tblCellMar>
-            <w:top w:w="0" w:type="dxa"/>
-            <w:bottom w:w="0" w:type="dxa"/>
-          </w:tblCellMar>
-        </w:tblPrEx>
         <w:tc>
           <w:tcPr>
             <w:tcW w:w="3200" w:type="dxa"/>
@@ -39214,12 +37223,6 @@
         </w:tc>
       </w:tr>
       <w:tr>
-        <w:tblPrEx>
-          <w:tblCellMar>
-            <w:top w:w="0" w:type="dxa"/>
-            <w:bottom w:w="0" w:type="dxa"/>
-          </w:tblCellMar>
-        </w:tblPrEx>
         <w:tc>
           <w:tcPr>
             <w:tcW w:w="3200" w:type="dxa"/>
@@ -39306,12 +37309,6 @@
         </w:tc>
       </w:tr>
       <w:tr>
-        <w:tblPrEx>
-          <w:tblCellMar>
-            <w:top w:w="0" w:type="dxa"/>
-            <w:bottom w:w="0" w:type="dxa"/>
-          </w:tblCellMar>
-        </w:tblPrEx>
         <w:tc>
           <w:tcPr>
             <w:tcW w:w="3200" w:type="dxa"/>
@@ -39398,12 +37395,6 @@
         </w:tc>
       </w:tr>
       <w:tr>
-        <w:tblPrEx>
-          <w:tblCellMar>
-            <w:top w:w="0" w:type="dxa"/>
-            <w:bottom w:w="0" w:type="dxa"/>
-          </w:tblCellMar>
-        </w:tblPrEx>
         <w:tc>
           <w:tcPr>
             <w:tcW w:w="3200" w:type="dxa"/>
@@ -39490,12 +37481,6 @@
         </w:tc>
       </w:tr>
       <w:tr>
-        <w:tblPrEx>
-          <w:tblCellMar>
-            <w:top w:w="0" w:type="dxa"/>
-            <w:bottom w:w="0" w:type="dxa"/>
-          </w:tblCellMar>
-        </w:tblPrEx>
         <w:tc>
           <w:tcPr>
             <w:tcW w:w="3200" w:type="dxa"/>
@@ -39582,12 +37567,6 @@
         </w:tc>
       </w:tr>
       <w:tr>
-        <w:tblPrEx>
-          <w:tblCellMar>
-            <w:top w:w="0" w:type="dxa"/>
-            <w:bottom w:w="0" w:type="dxa"/>
-          </w:tblCellMar>
-        </w:tblPrEx>
         <w:tc>
           <w:tcPr>
             <w:tcW w:w="3200" w:type="dxa"/>
@@ -39674,12 +37653,6 @@
         </w:tc>
       </w:tr>
       <w:tr>
-        <w:tblPrEx>
-          <w:tblCellMar>
-            <w:top w:w="0" w:type="dxa"/>
-            <w:bottom w:w="0" w:type="dxa"/>
-          </w:tblCellMar>
-        </w:tblPrEx>
         <w:tc>
           <w:tcPr>
             <w:tcW w:w="3200" w:type="dxa"/>
@@ -39766,12 +37739,6 @@
         </w:tc>
       </w:tr>
       <w:tr>
-        <w:tblPrEx>
-          <w:tblCellMar>
-            <w:top w:w="0" w:type="dxa"/>
-            <w:bottom w:w="0" w:type="dxa"/>
-          </w:tblCellMar>
-        </w:tblPrEx>
         <w:tc>
           <w:tcPr>
             <w:tcW w:w="3200" w:type="dxa"/>
@@ -39858,12 +37825,6 @@
         </w:tc>
       </w:tr>
       <w:tr>
-        <w:tblPrEx>
-          <w:tblCellMar>
-            <w:top w:w="0" w:type="dxa"/>
-            <w:bottom w:w="0" w:type="dxa"/>
-          </w:tblCellMar>
-        </w:tblPrEx>
         <w:tc>
           <w:tcPr>
             <w:tcW w:w="3200" w:type="dxa"/>
@@ -39950,12 +37911,6 @@
         </w:tc>
       </w:tr>
       <w:tr>
-        <w:tblPrEx>
-          <w:tblCellMar>
-            <w:top w:w="0" w:type="dxa"/>
-            <w:bottom w:w="0" w:type="dxa"/>
-          </w:tblCellMar>
-        </w:tblPrEx>
         <w:tc>
           <w:tcPr>
             <w:tcW w:w="3200" w:type="dxa"/>
@@ -40042,12 +37997,6 @@
         </w:tc>
       </w:tr>
       <w:tr>
-        <w:tblPrEx>
-          <w:tblCellMar>
-            <w:top w:w="0" w:type="dxa"/>
-            <w:bottom w:w="0" w:type="dxa"/>
-          </w:tblCellMar>
-        </w:tblPrEx>
         <w:tc>
           <w:tcPr>
             <w:tcW w:w="3200" w:type="dxa"/>
@@ -40134,12 +38083,6 @@
         </w:tc>
       </w:tr>
       <w:tr>
-        <w:tblPrEx>
-          <w:tblCellMar>
-            <w:top w:w="0" w:type="dxa"/>
-            <w:bottom w:w="0" w:type="dxa"/>
-          </w:tblCellMar>
-        </w:tblPrEx>
         <w:tc>
           <w:tcPr>
             <w:tcW w:w="3200" w:type="dxa"/>
@@ -40226,12 +38169,6 @@
         </w:tc>
       </w:tr>
       <w:tr>
-        <w:tblPrEx>
-          <w:tblCellMar>
-            <w:top w:w="0" w:type="dxa"/>
-            <w:bottom w:w="0" w:type="dxa"/>
-          </w:tblCellMar>
-        </w:tblPrEx>
         <w:tc>
           <w:tcPr>
             <w:tcW w:w="3200" w:type="dxa"/>

</xml_diff>